<commit_message>
Restructure the EN report as a leadership/investor progress report (draft)
Rewrite content_en.py from the original Field Training Report structure
into an 8-section business-decision framing (Executive Summary, business
problem, architecture, evidence with corrected real numbers, cost-to-scale
economics, application status, risks, recommendation) per audience: company
owner deciding on direction, investors deciding on funding -- not an
academic committee. Uses the corrected v20-vs-v2 detector comparison and
real training-cost figures from docs/report/RESEARCH_NOTES.md.

Draft pending user review before the Arabic version is updated to match.
AR docx/pdf rebuild in this commit reflects only the unrelated regeneration
timestamp, not new Arabic content.
</commit_message>
<xml_diff>
--- a/docs/report/out/Aystro_Field_Training_Report_EN.docx
+++ b/docs/report/out/Aystro_Field_Training_Report_EN.docx
@@ -40,7 +40,7 @@
           <w:sz w:val="42"/>
           <w:szCs w:val="42"/>
         </w:rPr>
-        <w:t>Applied Computer Vision for Automated Retail Shelf Auditing</w:t>
+        <w:t>Automated Retail Shelf Auditing: Technical Progress and Investment Readiness</w:t>
       </w:r>
     </w:p>
     <w:p>
@@ -59,7 +59,7 @@
           <w:sz w:val="28"/>
           <w:szCs w:val="28"/>
         </w:rPr>
-        <w:t>A Field Training Report</w:t>
+        <w:t>A Report to Leadership and Investors</w:t>
       </w:r>
     </w:p>
     <w:p>
@@ -77,7 +77,7 @@
           <w:sz w:val="23"/>
           <w:szCs w:val="23"/>
         </w:rPr>
-        <w:t xml:space="preserve">Trainee:  </w:t>
+        <w:t xml:space="preserve">Prepared by:  </w:t>
       </w:r>
       <w:r>
         <w:rPr>
@@ -106,7 +106,7 @@
           <w:sz w:val="23"/>
           <w:szCs w:val="23"/>
         </w:rPr>
-        <w:t xml:space="preserve">Host Organization:  </w:t>
+        <w:t xml:space="preserve">Organization:  </w:t>
       </w:r>
       <w:r>
         <w:rPr>
@@ -135,7 +135,7 @@
           <w:sz w:val="23"/>
           <w:szCs w:val="23"/>
         </w:rPr>
-        <w:t xml:space="preserve">Training Period:  </w:t>
+        <w:t xml:space="preserve">Reporting Period:  </w:t>
       </w:r>
       <w:r>
         <w:rPr>
@@ -146,7 +146,7 @@
           <w:sz w:val="23"/>
           <w:szCs w:val="23"/>
         </w:rPr>
-        <w:t>27 July 2026 – 6 August 2026</w:t>
+        <w:t>27 July 2026 – 14 August 2026</w:t>
       </w:r>
     </w:p>
     <w:p>
@@ -175,7 +175,7 @@
           <w:sz w:val="23"/>
           <w:szCs w:val="23"/>
         </w:rPr>
-        <w:t>8 August 2026</w:t>
+        <w:t>15 August 2026</w:t>
       </w:r>
     </w:p>
     <w:p>
@@ -199,7 +199,7 @@
           <w:sz w:val="28"/>
           <w:szCs w:val="28"/>
         </w:rPr>
-        <w:t>Abstract</w:t>
+        <w:t>Executive Summary</w:t>
       </w:r>
     </w:p>
     <w:p>
@@ -217,7 +217,7 @@
           <w:sz w:val="22"/>
           <w:szCs w:val="22"/>
         </w:rPr>
-        <w:t>This report documents the technical concepts acquired and the work undertaken during a two-week field training period at Aystro, focused on computer vision systems for automated retail shelf auditing. The work comprised two complementary strands: an analytical strand, in which an existing object detection dataset of 213 shelf photographs containing 4,641 manually annotated bounding boxes was audited and a revised system architecture derived; and an implementation strand, in which a cross-platform data collection application was developed to support field capture, automated analysis, and human verification of model output.</w:t>
+        <w:t>This report answers one question directly: is the computer-vision architecture Aystro is building on the right one to keep investing in, or should scope change? The short answer is that the direction is validated by measured evidence, not just design reasoning, and the evidence is now real rather than projected — trained models, real accuracy numbers, and a working application, not a proposal.</w:t>
       </w:r>
     </w:p>
     <w:p>
@@ -235,7 +235,25 @@
           <w:sz w:val="22"/>
           <w:szCs w:val="22"/>
         </w:rPr>
-        <w:t>The report examines the detect-then-recognize architectural pattern, in which spatial localization is deliberately decoupled from identity classification, and documents a structural limitation of similarity-based visual classification: because the embedding model resizes every crop to a fixed square before encoding it, aspect ratio is discarded and containers of identical labelling but differing physical proportion become indistinguishable. This limitation was resolved by fusing bounding-box geometry, already produced by the detection stage, with the visual signal — an approach implemented and verified in the delivered application.</w:t>
+        <w:t>The core architectural bet — separating "where is a product" (detection) from "what product is it" (classification), instead of one model doing both — has been built and measured against the original single-stage approach. The new detector reaches higher accuracy and precision using roughly a third of the training images the original approach needed, at a training cost increase of well under one percent of a single month's cheapest paid Roboflow plan. Adding a new flavour variant to an existing brand — demonstrated in practice for Fanta during this engagement — took hours of labelling and one small classifier, not a retrain of the core system. That is the economic case for this architecture in one sentence: catalogue growth is now a data task, not an engineering one.</w:t>
+      </w:r>
+    </w:p>
+    <w:p>
+      <w:pPr>
+        <w:keepNext w:val="0"/>
+        <w:spacing w:after="160" w:before="0" w:line="348" w:lineRule="auto"/>
+        <w:jc w:val="both"/>
+      </w:pPr>
+      <w:r>
+        <w:rPr>
+          <w:rFonts w:ascii="Times New Roman" w:hAnsi="Times New Roman" w:cs="Times New Roman"/>
+          <w:b w:val="0"/>
+          <w:i w:val="0"/>
+          <w:color w:val="111111"/>
+          <w:sz w:val="22"/>
+          <w:szCs w:val="22"/>
+        </w:rPr>
+        <w:t>The report is equally direct about what is not yet proven. Classifier-layer accuracy has not yet been formally measured (a same-day fix). Two newer signals — Coca-Cola flavour variants and packaging material — are mid-experiment and constrained by real data gaps, not model performance: the available Coca-Cola photographs turned out on inspection to be almost entirely one variant, and only two genuine glass-packaging examples exist across the whole labelled corpus. Both gaps have a known, inexpensive fix — targeted photography — rather than an open-ended research problem. A geometric packaging-format rule described in earlier work has been suspended in production because it did not generalise reliably enough; the code is kept, not discarded, pending a better approach. These are stated plainly because a credible investment case rests on knowing the real gaps, not on a report with none.</w:t>
       </w:r>
     </w:p>
     <w:p>
@@ -259,7 +277,7 @@
           <w:sz w:val="28"/>
           <w:szCs w:val="28"/>
         </w:rPr>
-        <w:t>1. Introduction and Problem Context</w:t>
+        <w:t>1. The Business Problem</w:t>
       </w:r>
     </w:p>
     <w:p>
@@ -277,7 +295,7 @@
           <w:sz w:val="23"/>
           <w:szCs w:val="23"/>
         </w:rPr>
-        <w:t>Object detection is a foundational task in computer vision that answers two coupled questions about an image: where an object is located (localization) and what that object is (classification). In retail shelf auditing, the practical objective is to convert a photograph of a store shelf into structured commercial data — how many units of each product are present, how they are arranged, and what share of the visible shelf each brand occupies. This requires both answers simultaneously, since a count without positions cannot describe shelf layout, and positions without identities cannot describe inventory.</w:t>
+        <w:t>A retail brand's on-shelf presence — how many units are stocked, how they are arranged, and what share of a shelf each competitor occupies — is commercial information manufacturers and retailers pay to know, and today that information is gathered by a person walking the aisle with a clipboard or a phone. Manual audits are slow, expensive to scale across many stores, and only as consistent as the person performing them. The commercial opportunity is converting an ordinary shelf photograph into structured, trustworthy inventory data automatically, at the volume and speed manual auditing cannot reach.</w:t>
       </w:r>
     </w:p>
     <w:p>
@@ -295,7 +313,7 @@
           <w:sz w:val="23"/>
           <w:szCs w:val="23"/>
         </w:rPr>
-        <w:t>The dataset examined at the outset of the training had been annotated according to manufacturer brand, assigning each bounding box a class such as coca-cola or pepsi. This labelling scheme, while intuitive, exposed a set of structural problems that formed the analytical core of the training period and are examined in the sections that follow.</w:t>
+        <w:t>The technical challenge is that this is not one problem but two, asked of every object in the photograph at once: where is it (localisation), and what is it (identity). A system that answers both questions with a single monolithic model inherits a serious commercial liability, examined next, that determines whether the product can keep pace with a retail catalogue that never stops changing.</w:t>
       </w:r>
     </w:p>
     <w:p>
@@ -366,7 +384,7 @@
           <w:sz w:val="19"/>
           <w:szCs w:val="19"/>
         </w:rPr>
-        <w:t>A field capture from the dataset with its relabelled bounding boxes overlaid; colour denotes packaging format. Beyond the density of the audit scene, the image shows two limitations examined later: many products carry no annotation at all (Section 4), and several boxes are assigned a format their contents contradict, the geometry having been degraded by glass reflection and occlusion (Section 7).</w:t>
+        <w:t>A field capture with its detections overlaid; colour denotes brand. The density of a real audit scene — many products, tightly packed, photographed under ordinary store lighting — is the actual operating condition this system is built for, not a controlled benchmark.</w:t>
       </w:r>
     </w:p>
     <w:p>
@@ -385,7 +403,7 @@
           <w:sz w:val="28"/>
           <w:szCs w:val="28"/>
         </w:rPr>
-        <w:t>2. Methodology and Scope of Work</w:t>
+        <w:t>2. What Was Built: The Architecture</w:t>
       </w:r>
     </w:p>
     <w:p>
@@ -403,26 +421,7 @@
           <w:sz w:val="23"/>
           <w:szCs w:val="23"/>
         </w:rPr>
-        <w:t>The training followed an investigative rather than a purely implementational approach. An existing annotated dataset was audited, its limitations diagnosed, a revised architecture derived and validated for feasibility against the production platform, and a supporting field application developed and tested.</w:t>
-      </w:r>
-    </w:p>
-    <w:p>
-      <w:pPr>
-        <w:keepNext/>
-        <w:spacing w:before="240" w:after="140"/>
-        <w:jc w:val="left"/>
-      </w:pPr>
-      <w:r>
-        <w:rPr>
-          <w:rFonts w:ascii="Times New Roman" w:hAnsi="Times New Roman" w:cs="Times New Roman"/>
-          <w:b/>
-          <w:bCs w:val="1"/>
-          <w:i w:val="0"/>
-          <w:color w:val="1A3A5C"/>
-          <w:sz w:val="24"/>
-          <w:szCs w:val="24"/>
-        </w:rPr>
-        <w:t>2.1 Dataset Audit</w:t>
+        <w:t>A single model that classifies each product directly by identity must be retrained every time a new stock-keeping unit (SKU) enters the catalogue — expensive in annotation effort and compute, and risking regressions on products that were previously working. It also suffers statistically: a fixed pool of training images split across many brand classes starves the rarer classes, which is exactly the low-recall failure mode observed in this project's own early data (Section 3.1).</w:t>
       </w:r>
     </w:p>
     <w:p>
@@ -440,7 +439,79 @@
           <w:sz w:val="23"/>
           <w:szCs w:val="23"/>
         </w:rPr>
-        <w:t>The existing project export was analysed programmatically. It comprised 213 shelf photographs partitioned into training (173), validation (24), and test (16) splits, containing 4,641 manually drawn bounding boxes across six manufacturer classes: coca-cola, cappy, xl_energy, sprite, fanta, and pepsi. The project had grown incrementally, beginning with coca-cola and xl_energy before the remaining four brands were introduced — an expansion pattern that itself exemplifies the catalogue growth problem examined in Section 3.</w:t>
+        <w:t>The system built during this engagement separates the volatile part of the problem (product identity, which changes constantly) from the stable part (object presence, which does not), and narrows the decision space one stage at a time:</w:t>
+      </w:r>
+    </w:p>
+    <w:p>
+      <w:pPr>
+        <w:keepNext w:val="0"/>
+        <w:spacing w:after="120" w:before="0" w:line="348" w:lineRule="auto"/>
+        <w:jc w:val="both"/>
+      </w:pPr>
+      <w:r>
+        <w:rPr>
+          <w:rFonts w:ascii="Times New Roman" w:hAnsi="Times New Roman" w:cs="Times New Roman"/>
+          <w:b w:val="0"/>
+          <w:i w:val="0"/>
+          <w:color w:val="111111"/>
+          <w:sz w:val="23"/>
+          <w:szCs w:val="23"/>
+        </w:rPr>
+        <w:t>Stage 1 — Detection. A class-agnostic detector locates every product on the shelf under a single generic "product" class, regardless of brand. It never needs retraining when a new SKU appears, because it holds no knowledge of identity to begin with.</w:t>
+      </w:r>
+    </w:p>
+    <w:p>
+      <w:pPr>
+        <w:keepNext w:val="0"/>
+        <w:spacing w:after="120" w:before="0" w:line="348" w:lineRule="auto"/>
+        <w:jc w:val="both"/>
+      </w:pPr>
+      <w:r>
+        <w:rPr>
+          <w:rFonts w:ascii="Times New Roman" w:hAnsi="Times New Roman" w:cs="Times New Roman"/>
+          <w:b w:val="0"/>
+          <w:i w:val="0"/>
+          <w:color w:val="111111"/>
+          <w:sz w:val="23"/>
+          <w:szCs w:val="23"/>
+        </w:rPr>
+        <w:t>Stage 2 — Brand classification. Each detected region is cropped and classified by manufacturer brand. This layer is small and stable, since the set of brands in a market changes far more slowly than the set of products.</w:t>
+      </w:r>
+    </w:p>
+    <w:p>
+      <w:pPr>
+        <w:keepNext w:val="0"/>
+        <w:spacing w:after="120" w:before="0" w:line="348" w:lineRule="auto"/>
+        <w:jc w:val="both"/>
+      </w:pPr>
+      <w:r>
+        <w:rPr>
+          <w:rFonts w:ascii="Times New Roman" w:hAnsi="Times New Roman" w:cs="Times New Roman"/>
+          <w:b w:val="0"/>
+          <w:i w:val="0"/>
+          <w:color w:val="111111"/>
+          <w:sz w:val="23"/>
+          <w:szCs w:val="23"/>
+        </w:rPr>
+        <w:t>Stage 3 — Variant classification. Within a brand, a further classifier resolves the specific flavour or product variant. Built and shipped for Fanta during this engagement; Coca-Cola is in progress (Section 3.2).</w:t>
+      </w:r>
+    </w:p>
+    <w:p>
+      <w:pPr>
+        <w:keepNext w:val="0"/>
+        <w:spacing w:after="120" w:before="0" w:line="348" w:lineRule="auto"/>
+        <w:jc w:val="both"/>
+      </w:pPr>
+      <w:r>
+        <w:rPr>
+          <w:rFonts w:ascii="Times New Roman" w:hAnsi="Times New Roman" w:cs="Times New Roman"/>
+          <w:b w:val="0"/>
+          <w:i w:val="0"/>
+          <w:color w:val="111111"/>
+          <w:sz w:val="23"/>
+          <w:szCs w:val="23"/>
+        </w:rPr>
+        <w:t>An experimental fourth signal — packaging material (glass / plastic / can), independent of brand — is under evaluation in parallel (Section 3.3).</w:t>
       </w:r>
     </w:p>
     <w:p>
@@ -458,246 +529,7 @@
           <w:sz w:val="23"/>
           <w:szCs w:val="23"/>
         </w:rPr>
-        <w:t>Class distribution analysis revealed pronounced imbalance: the largest class accounted for 42.2% of all annotations while the smallest accounted for 2.8%, a ratio of approximately 15:1. This concentration provides a direct statistical account of the low recall observed on sparsely represented brands.</w:t>
-      </w:r>
-    </w:p>
-    <w:p>
-      <w:pPr>
-        <w:keepNext/>
-        <w:spacing w:before="240" w:after="140"/>
-        <w:jc w:val="left"/>
-      </w:pPr>
-      <w:r>
-        <w:rPr>
-          <w:rFonts w:ascii="Times New Roman" w:hAnsi="Times New Roman" w:cs="Times New Roman"/>
-          <w:b/>
-          <w:bCs w:val="1"/>
-          <w:i w:val="0"/>
-          <w:color w:val="1A3A5C"/>
-          <w:sz w:val="24"/>
-          <w:szCs w:val="24"/>
-        </w:rPr>
-        <w:t>2.2 Geometric Relabelling</w:t>
-      </w:r>
-    </w:p>
-    <w:p>
-      <w:pPr>
-        <w:keepNext w:val="0"/>
-        <w:spacing w:after="160" w:before="0" w:line="348" w:lineRule="auto"/>
-        <w:jc w:val="both"/>
-      </w:pPr>
-      <w:r>
-        <w:rPr>
-          <w:rFonts w:ascii="Times New Roman" w:hAnsi="Times New Roman" w:cs="Times New Roman"/>
-          <w:b w:val="0"/>
-          <w:i w:val="0"/>
-          <w:color w:val="111111"/>
-          <w:sz w:val="23"/>
-          <w:szCs w:val="23"/>
-        </w:rPr>
-        <w:t>A relabelling scheme based on physical packaging format rather than brand was derived. For each annotation, the aspect ratio was computed from the stored box coordinates and mapped to one of four format classes — can-std-330, can-slim, bottle-pet, and unknown-package — using empirically determined ratio bands. Annotations were regenerated programmatically in Pascal VOC XML format and migrated to a separate project.</w:t>
-      </w:r>
-    </w:p>
-    <w:p>
-      <w:pPr>
-        <w:keepNext/>
-        <w:spacing w:before="240" w:after="140"/>
-        <w:jc w:val="left"/>
-      </w:pPr>
-      <w:r>
-        <w:rPr>
-          <w:rFonts w:ascii="Times New Roman" w:hAnsi="Times New Roman" w:cs="Times New Roman"/>
-          <w:b/>
-          <w:bCs w:val="1"/>
-          <w:i w:val="0"/>
-          <w:color w:val="1A3A5C"/>
-          <w:sz w:val="24"/>
-          <w:szCs w:val="24"/>
-        </w:rPr>
-        <w:t>2.3 Ambiguity Flagging</w:t>
-      </w:r>
-    </w:p>
-    <w:p>
-      <w:pPr>
-        <w:keepNext w:val="0"/>
-        <w:spacing w:after="160" w:before="0" w:line="348" w:lineRule="auto"/>
-        <w:jc w:val="both"/>
-      </w:pPr>
-      <w:r>
-        <w:rPr>
-          <w:rFonts w:ascii="Times New Roman" w:hAnsi="Times New Roman" w:cs="Times New Roman"/>
-          <w:b w:val="0"/>
-          <w:i w:val="0"/>
-          <w:color w:val="111111"/>
-          <w:sz w:val="23"/>
-          <w:szCs w:val="23"/>
-        </w:rPr>
-        <w:t>Rather than assuming that every box admits a confident format assignment, each annotation was assessed for evidential reliability during relabelling and flagged where compromised. Of the 4,641 annotations, 194 (4.2%) were flagged as truncated — the object intersecting the frame boundary or extending beyond a close-up view — and 1,954 (42.1%) were flagged as difficult, denoting occlusion, oblique perspective, or specular interference sufficient to render the derived geometry unreliable.</w:t>
-      </w:r>
-    </w:p>
-    <w:p>
-      <w:pPr>
-        <w:keepNext w:val="0"/>
-        <w:spacing w:after="160" w:before="0" w:line="348" w:lineRule="auto"/>
-        <w:jc w:val="both"/>
-      </w:pPr>
-      <w:r>
-        <w:rPr>
-          <w:rFonts w:ascii="Times New Roman" w:hAnsi="Times New Roman" w:cs="Times New Roman"/>
-          <w:b w:val="0"/>
-          <w:i w:val="0"/>
-          <w:color w:val="111111"/>
-          <w:sz w:val="23"/>
-          <w:szCs w:val="23"/>
-        </w:rPr>
-        <w:t>That over two-fifths of the corpus required an ambiguity flag is itself a principal empirical finding of the training. It establishes that ambiguity in field imagery is structural rather than exceptional, and consequently that a deployed system must incorporate a verification mechanism by design rather than treat correction as an exceptional recovery path.</w:t>
-      </w:r>
-    </w:p>
-    <w:p>
-      <w:pPr>
-        <w:keepNext/>
-        <w:spacing w:before="240" w:after="140"/>
-        <w:jc w:val="left"/>
-      </w:pPr>
-      <w:r>
-        <w:rPr>
-          <w:rFonts w:ascii="Times New Roman" w:hAnsi="Times New Roman" w:cs="Times New Roman"/>
-          <w:b/>
-          <w:bCs w:val="1"/>
-          <w:i w:val="0"/>
-          <w:color w:val="1A3A5C"/>
-          <w:sz w:val="24"/>
-          <w:szCs w:val="24"/>
-        </w:rPr>
-        <w:t>2.4 Platform Feasibility Assessment</w:t>
-      </w:r>
-    </w:p>
-    <w:p>
-      <w:pPr>
-        <w:keepNext w:val="0"/>
-        <w:spacing w:after="160" w:before="0" w:line="348" w:lineRule="auto"/>
-        <w:jc w:val="both"/>
-      </w:pPr>
-      <w:r>
-        <w:rPr>
-          <w:rFonts w:ascii="Times New Roman" w:hAnsi="Times New Roman" w:cs="Times New Roman"/>
-          <w:b w:val="0"/>
-          <w:i w:val="0"/>
-          <w:color w:val="111111"/>
-          <w:sz w:val="23"/>
-          <w:szCs w:val="23"/>
-        </w:rPr>
-        <w:t>The proposed architecture was evaluated block-by-block against the component catalogue of Roboflow Workflows to confirm that each stage could be realised natively within the platform. The findings are reported in Section 9.</w:t>
-      </w:r>
-    </w:p>
-    <w:p>
-      <w:pPr>
-        <w:keepNext/>
-        <w:spacing w:before="240" w:after="140"/>
-        <w:jc w:val="left"/>
-      </w:pPr>
-      <w:r>
-        <w:rPr>
-          <w:rFonts w:ascii="Times New Roman" w:hAnsi="Times New Roman" w:cs="Times New Roman"/>
-          <w:b/>
-          <w:bCs w:val="1"/>
-          <w:i w:val="0"/>
-          <w:color w:val="1A3A5C"/>
-          <w:sz w:val="24"/>
-          <w:szCs w:val="24"/>
-        </w:rPr>
-        <w:t>2.5 Application Development</w:t>
-      </w:r>
-    </w:p>
-    <w:p>
-      <w:pPr>
-        <w:keepNext w:val="0"/>
-        <w:spacing w:after="160" w:before="0" w:line="348" w:lineRule="auto"/>
-        <w:jc w:val="both"/>
-      </w:pPr>
-      <w:r>
-        <w:rPr>
-          <w:rFonts w:ascii="Times New Roman" w:hAnsi="Times New Roman" w:cs="Times New Roman"/>
-          <w:b w:val="0"/>
-          <w:i w:val="0"/>
-          <w:color w:val="111111"/>
-          <w:sz w:val="23"/>
-          <w:szCs w:val="23"/>
-        </w:rPr>
-        <w:t>A cross-platform data collection application was implemented in Flutter to support structured field capture, automated analysis, and human verification. Its architecture and the reasoning behind it are described in Section 10.</w:t>
-      </w:r>
-    </w:p>
-    <w:p>
-      <w:pPr>
-        <w:keepNext/>
-        <w:spacing w:before="360" w:after="140"/>
-        <w:jc w:val="left"/>
-      </w:pPr>
-      <w:r>
-        <w:rPr>
-          <w:rFonts w:ascii="Times New Roman" w:hAnsi="Times New Roman" w:cs="Times New Roman"/>
-          <w:b/>
-          <w:bCs w:val="1"/>
-          <w:i w:val="0"/>
-          <w:color w:val="1A3A5C"/>
-          <w:sz w:val="28"/>
-          <w:szCs w:val="28"/>
-        </w:rPr>
-        <w:t>3. The Catalogue Expansion Problem</w:t>
-      </w:r>
-    </w:p>
-    <w:p>
-      <w:pPr>
-        <w:keepNext w:val="0"/>
-        <w:spacing w:after="160" w:before="0" w:line="348" w:lineRule="auto"/>
-        <w:jc w:val="both"/>
-      </w:pPr>
-      <w:r>
-        <w:rPr>
-          <w:rFonts w:ascii="Times New Roman" w:hAnsi="Times New Roman" w:cs="Times New Roman"/>
-          <w:b w:val="0"/>
-          <w:i w:val="0"/>
-          <w:color w:val="111111"/>
-          <w:sz w:val="23"/>
-          <w:szCs w:val="23"/>
-        </w:rPr>
-        <w:t>A single-stage detector that classifies each product directly by its identity inherits a serious maintenance liability: the retail catalogue is not static. New stock-keeping units (SKUs) enter the market continuously, and under a monolithic design each addition requires retraining the entire detection model — expensive in computation, in annotation effort, and in time, and degrading a system that was previously working correctly for all existing products.</w:t>
-      </w:r>
-    </w:p>
-    <w:p>
-      <w:pPr>
-        <w:keepNext w:val="0"/>
-        <w:spacing w:after="160" w:before="0" w:line="348" w:lineRule="auto"/>
-        <w:jc w:val="both"/>
-      </w:pPr>
-      <w:r>
-        <w:rPr>
-          <w:rFonts w:ascii="Times New Roman" w:hAnsi="Times New Roman" w:cs="Times New Roman"/>
-          <w:b w:val="0"/>
-          <w:i w:val="0"/>
-          <w:color w:val="111111"/>
-          <w:sz w:val="23"/>
-          <w:szCs w:val="23"/>
-        </w:rPr>
-        <w:t>A second, statistical problem was observed in the dataset directly. When a fixed corpus of 213 images is partitioned across many brand classes, each class receives only a small share of the available examples. The model consequently learns well on densely represented classes and performs poorly on the remainder, producing the low recall — products present on the shelf but never detected — observed in the existing model.</w:t>
-      </w:r>
-    </w:p>
-    <w:p>
-      <w:pPr>
-        <w:keepNext w:val="0"/>
-        <w:spacing w:after="160" w:before="0" w:line="348" w:lineRule="auto"/>
-        <w:jc w:val="both"/>
-      </w:pPr>
-      <w:r>
-        <w:rPr>
-          <w:rFonts w:ascii="Times New Roman" w:hAnsi="Times New Roman" w:cs="Times New Roman"/>
-          <w:b w:val="0"/>
-          <w:i w:val="0"/>
-          <w:color w:val="111111"/>
-          <w:sz w:val="23"/>
-          <w:szCs w:val="23"/>
-        </w:rPr>
-        <w:t>The project's own history illustrates the mechanism directly: the earliest trained model version was fitted on 27 images, before most classes existed, and remained the workflow default long after the catalogue had grown beyond it. Coverage of the newer brands was therefore governed not by any deficiency of the detection method but by which model version the pipeline happened to invoke.</w:t>
+        <w:t>This is implemented as a live, hierarchical Roboflow Workflow, not a proposal: a shared detector feeds crops to a brand classifier and a flavour classifier running in parallel, and a small merge step selects the flavour label only when the brand it belongs to actually has one, otherwise passing the plain brand through unchanged. Restricting brand-variant comparison to one manufacturer's catalogue rather than the entire market also reduces visual confusion between candidates.</w:t>
       </w:r>
     </w:p>
     <w:p>
@@ -709,7 +541,7 @@
       <w:r>
         <w:drawing>
           <wp:inline xmlns:a="http://schemas.openxmlformats.org/drawingml/2006/main" xmlns:pic="http://schemas.openxmlformats.org/drawingml/2006/picture">
-            <wp:extent cx="5544000" cy="2464000"/>
+            <wp:extent cx="5544000" cy="2895200"/>
             <wp:docPr id="2" name="Picture 2"/>
             <wp:cNvGraphicFramePr>
               <a:graphicFrameLocks noChangeAspect="1"/>
@@ -718,7 +550,7 @@
               <a:graphicData uri="http://schemas.openxmlformats.org/drawingml/2006/picture">
                 <pic:pic>
                   <pic:nvPicPr>
-                    <pic:cNvPr id="0" name="fig5_distribution.png"/>
+                    <pic:cNvPr id="0" name="fig3_pipeline.png"/>
                     <pic:cNvPicPr/>
                   </pic:nvPicPr>
                   <pic:blipFill>
@@ -730,7 +562,7 @@
                   <pic:spPr>
                     <a:xfrm>
                       <a:off x="0" y="0"/>
-                      <a:ext cx="5544000" cy="2464000"/>
+                      <a:ext cx="5544000" cy="2895200"/>
                     </a:xfrm>
                     <a:prstGeom prst="rect"/>
                   </pic:spPr>
@@ -768,7 +600,7 @@
           <w:sz w:val="19"/>
           <w:szCs w:val="19"/>
         </w:rPr>
-        <w:t>Annotation distribution before and after geometric relabelling. The same 4,641 boxes are partitioned by manufacturer brand (left) and by physical packaging format (right).</w:t>
+        <w:t>Block diagram of the staged pipeline: class-agnostic detection, region cropping, brand classification, and variant classification, with packaging material as an independent, parallel signal rather than a further narrowing of the same decision.</w:t>
       </w:r>
     </w:p>
     <w:p>
@@ -787,7 +619,26 @@
           <w:sz w:val="28"/>
           <w:szCs w:val="28"/>
         </w:rPr>
-        <w:t>4. Class-Agnostic Detection</w:t>
+        <w:t>3. Evidence: Does It Work?</w:t>
+      </w:r>
+    </w:p>
+    <w:p>
+      <w:pPr>
+        <w:keepNext/>
+        <w:spacing w:before="240" w:after="140"/>
+        <w:jc w:val="left"/>
+      </w:pPr>
+      <w:r>
+        <w:rPr>
+          <w:rFonts w:ascii="Times New Roman" w:hAnsi="Times New Roman" w:cs="Times New Roman"/>
+          <w:b/>
+          <w:bCs w:val="1"/>
+          <w:i w:val="0"/>
+          <w:color w:val="1A3A5C"/>
+          <w:sz w:val="24"/>
+          <w:szCs w:val="24"/>
+        </w:rPr>
+        <w:t>3.1 Detector accuracy: architecture change, measured</w:t>
       </w:r>
     </w:p>
     <w:p>
@@ -805,604 +656,7 @@
           <w:sz w:val="23"/>
           <w:szCs w:val="23"/>
         </w:rPr>
-        <w:t>The response to both problems is to strip the detection stage of identity information entirely. In a class-agnostic detector, every product is assigned a single generic class — product — regardless of brand, flavour, or packaging, and the model is trained to answer only the question of whether a product is present at a given location.</w:t>
-      </w:r>
-    </w:p>
-    <w:p>
-      <w:pPr>
-        <w:keepNext w:val="0"/>
-        <w:spacing w:after="160" w:before="0" w:line="348" w:lineRule="auto"/>
-        <w:jc w:val="both"/>
-      </w:pPr>
-      <w:r>
-        <w:rPr>
-          <w:rFonts w:ascii="Times New Roman" w:hAnsi="Times New Roman" w:cs="Times New Roman"/>
-          <w:b w:val="0"/>
-          <w:i w:val="0"/>
-          <w:color w:val="111111"/>
-          <w:sz w:val="23"/>
-          <w:szCs w:val="23"/>
-        </w:rPr>
-        <w:t>This yields two distinct benefits. Statistically, the entire corpus contributes to a single class rather than being fragmented, substantially increasing the effective training signal without collecting a single additional image. Architecturally, the detection layer becomes stable: holding no knowledge of product identity, it is not invalidated by the introduction of a new SKU and need not be retrained.</w:t>
-      </w:r>
-    </w:p>
-    <w:p>
-      <w:pPr>
-        <w:keepNext w:val="0"/>
-        <w:spacing w:after="160" w:before="0" w:line="348" w:lineRule="auto"/>
-        <w:jc w:val="both"/>
-      </w:pPr>
-      <w:r>
-        <w:rPr>
-          <w:rFonts w:ascii="Times New Roman" w:hAnsi="Times New Roman" w:cs="Times New Roman"/>
-          <w:b w:val="0"/>
-          <w:i w:val="0"/>
-          <w:color w:val="111111"/>
-          <w:sz w:val="23"/>
-          <w:szCs w:val="23"/>
-        </w:rPr>
-        <w:t>An important practical qualification was established during the training: relabelling existing annotations to a generic class corrects mislabelled boxes, but cannot recover products that were never annotated at all. Missing annotations remain a separate data-completeness task, and no reorganisation of the label space substitutes for them.</w:t>
-      </w:r>
-    </w:p>
-    <w:p>
-      <w:pPr>
-        <w:keepNext/>
-        <w:spacing w:before="360" w:after="140"/>
-        <w:jc w:val="left"/>
-      </w:pPr>
-      <w:r>
-        <w:rPr>
-          <w:rFonts w:ascii="Times New Roman" w:hAnsi="Times New Roman" w:cs="Times New Roman"/>
-          <w:b/>
-          <w:bCs w:val="1"/>
-          <w:i w:val="0"/>
-          <w:color w:val="1A3A5C"/>
-          <w:sz w:val="28"/>
-          <w:szCs w:val="28"/>
-        </w:rPr>
-        <w:t>5. Recognition by Embedding Similarity</w:t>
-      </w:r>
-    </w:p>
-    <w:p>
-      <w:pPr>
-        <w:keepNext w:val="0"/>
-        <w:spacing w:after="160" w:before="0" w:line="348" w:lineRule="auto"/>
-        <w:jc w:val="both"/>
-      </w:pPr>
-      <w:r>
-        <w:rPr>
-          <w:rFonts w:ascii="Times New Roman" w:hAnsi="Times New Roman" w:cs="Times New Roman"/>
-          <w:b w:val="0"/>
-          <w:i w:val="0"/>
-          <w:color w:val="111111"/>
-          <w:sz w:val="23"/>
-          <w:szCs w:val="23"/>
-        </w:rPr>
-        <w:t>Once localization is decoupled, identity must be resolved separately. The approach studied replaces conventional supervised classification with embedding-based retrieval: each detected region is cropped and passed through a vision-language model — CLIP — which maps the image into a high-dimensional numerical vector. Classification is performed by finding the nearest neighbour among a reference gallery of clean, known product images.</w:t>
-      </w:r>
-    </w:p>
-    <w:p>
-      <w:pPr>
-        <w:keepNext w:val="0"/>
-        <w:spacing w:after="160" w:before="0" w:line="348" w:lineRule="auto"/>
-        <w:jc w:val="both"/>
-      </w:pPr>
-      <w:r>
-        <w:rPr>
-          <w:rFonts w:ascii="Times New Roman" w:hAnsi="Times New Roman" w:cs="Times New Roman"/>
-          <w:b w:val="0"/>
-          <w:i w:val="0"/>
-          <w:color w:val="111111"/>
-          <w:sz w:val="23"/>
-          <w:szCs w:val="23"/>
-        </w:rPr>
-        <w:t>The decisive property of this approach is that adding a new product requires only adding its reference image to the gallery; no retraining occurs. This transforms catalogue maintenance from a model-training operation into a data-entry operation, which is the central reason the pattern is favoured in production retail systems.</w:t>
-      </w:r>
-    </w:p>
-    <w:p>
-      <w:pPr>
-        <w:keepNext/>
-        <w:spacing w:before="360" w:after="140"/>
-        <w:jc w:val="left"/>
-      </w:pPr>
-      <w:r>
-        <w:rPr>
-          <w:rFonts w:ascii="Times New Roman" w:hAnsi="Times New Roman" w:cs="Times New Roman"/>
-          <w:b/>
-          <w:bCs w:val="1"/>
-          <w:i w:val="0"/>
-          <w:color w:val="1A3A5C"/>
-          <w:sz w:val="28"/>
-          <w:szCs w:val="28"/>
-        </w:rPr>
-        <w:t>6. The Geometric Limitation of Visual Similarity</w:t>
-      </w:r>
-    </w:p>
-    <w:p>
-      <w:pPr>
-        <w:keepNext w:val="0"/>
-        <w:spacing w:after="160" w:before="0" w:line="348" w:lineRule="auto"/>
-        <w:jc w:val="both"/>
-      </w:pPr>
-      <w:r>
-        <w:rPr>
-          <w:rFonts w:ascii="Times New Roman" w:hAnsi="Times New Roman" w:cs="Times New Roman"/>
-          <w:b w:val="0"/>
-          <w:i w:val="0"/>
-          <w:color w:val="111111"/>
-          <w:sz w:val="23"/>
-          <w:szCs w:val="23"/>
-        </w:rPr>
-        <w:t>A significant limitation of embedding-based recognition was identified during the training, and its mechanism established precisely. CLIP resizes every crop to a fixed square input — 224 by 224 pixels — before encoding it. This operation discards aspect ratio by construction: a tall narrow container and a shorter wider one arrive at the encoder having been stretched to the same shape. The model is therefore not merely insensitive to physical proportion; the information has been removed before inference begins.</w:t>
-      </w:r>
-    </w:p>
-    <w:p>
-      <w:pPr>
-        <w:keepNext w:val="0"/>
-        <w:spacing w:after="160" w:before="0" w:line="348" w:lineRule="auto"/>
-        <w:jc w:val="both"/>
-      </w:pPr>
-      <w:r>
-        <w:rPr>
-          <w:rFonts w:ascii="Times New Roman" w:hAnsi="Times New Roman" w:cs="Times New Roman"/>
-          <w:b w:val="0"/>
-          <w:i w:val="0"/>
-          <w:color w:val="111111"/>
-          <w:sz w:val="23"/>
-          <w:szCs w:val="23"/>
-        </w:rPr>
-        <w:t>The consequence is acute for products that differ only in packaging format. A standard 330 ml can measures approximately 66 mm in diameter by 115 mm in height, a ratio of about 1.74; a sleek 330 ml can measures approximately 53 mm by 145 mm, a ratio of about 2.7. The two hold identical contents and carry identical branding, so proportion is the only reliable distinguishing signal — and it is precisely the signal the embedding cannot see.</w:t>
-      </w:r>
-    </w:p>
-    <w:p>
-      <w:pPr>
-        <w:keepNext w:val="0"/>
-        <w:spacing w:after="160" w:before="0" w:line="348" w:lineRule="auto"/>
-        <w:jc w:val="both"/>
-      </w:pPr>
-      <w:r>
-        <w:rPr>
-          <w:rFonts w:ascii="Times New Roman" w:hAnsi="Times New Roman" w:cs="Times New Roman"/>
-          <w:b w:val="0"/>
-          <w:i w:val="0"/>
-          <w:color w:val="111111"/>
-          <w:sz w:val="23"/>
-          <w:szCs w:val="23"/>
-        </w:rPr>
-        <w:t>This was confirmed empirically. On a shelf photograph holding both formats side by side, the visual classifier assigned all ten cans to a single class, while the detector's own bounding boxes separated the two clusters cleanly: standard cans measured between 1.72 and 1.82, and sleek cans between 2.30 and 2.58, with an empty band between them. A decision threshold of 2.05 sits within that empty band, so neither cluster lies near it.</w:t>
-      </w:r>
-    </w:p>
-    <w:p>
-      <w:pPr>
-        <w:keepNext w:val="0"/>
-        <w:spacing w:after="160" w:before="0" w:line="348" w:lineRule="auto"/>
-        <w:jc w:val="both"/>
-      </w:pPr>
-      <w:r>
-        <w:rPr>
-          <w:rFonts w:ascii="Times New Roman" w:hAnsi="Times New Roman" w:cs="Times New Roman"/>
-          <w:b w:val="0"/>
-          <w:i w:val="0"/>
-          <w:color w:val="111111"/>
-          <w:sz w:val="23"/>
-          <w:szCs w:val="23"/>
-        </w:rPr>
-        <w:t>The resolution adopted recognises that the required discriminating information has already been produced by the detection stage. The aspect ratio of the bounding box is a direct geometric consequence of the container's physical form, and is approximately invariant to camera distance, since zooming scales both dimensions proportionally and leaves their ratio unchanged. Neither signal suffices alone: the visual embedding determines which product the object is, while bounding-box geometry determines which physical format it takes.</w:t>
-      </w:r>
-    </w:p>
-    <w:p>
-      <w:pPr>
-        <w:keepNext/>
-        <w:spacing w:before="240" w:after="80"/>
-        <w:jc w:val="center"/>
-      </w:pPr>
-      <w:r>
-        <w:drawing>
-          <wp:inline xmlns:a="http://schemas.openxmlformats.org/drawingml/2006/main" xmlns:pic="http://schemas.openxmlformats.org/drawingml/2006/picture">
-            <wp:extent cx="5544000" cy="2648800"/>
-            <wp:docPr id="3" name="Picture 3"/>
-            <wp:cNvGraphicFramePr>
-              <a:graphicFrameLocks noChangeAspect="1"/>
-            </wp:cNvGraphicFramePr>
-            <a:graphic>
-              <a:graphicData uri="http://schemas.openxmlformats.org/drawingml/2006/picture">
-                <pic:pic>
-                  <pic:nvPicPr>
-                    <pic:cNvPr id="0" name="fig2_aspect_ratio.png"/>
-                    <pic:cNvPicPr/>
-                  </pic:nvPicPr>
-                  <pic:blipFill>
-                    <a:blip r:embed="rId11"/>
-                    <a:stretch>
-                      <a:fillRect/>
-                    </a:stretch>
-                  </pic:blipFill>
-                  <pic:spPr>
-                    <a:xfrm>
-                      <a:off x="0" y="0"/>
-                      <a:ext cx="5544000" cy="2648800"/>
-                    </a:xfrm>
-                    <a:prstGeom prst="rect"/>
-                  </pic:spPr>
-                </pic:pic>
-              </a:graphicData>
-            </a:graphic>
-          </wp:inline>
-        </w:drawing>
-      </w:r>
-    </w:p>
-    <w:p>
-      <w:pPr>
-        <w:spacing w:after="280"/>
-        <w:jc w:val="center"/>
-      </w:pPr>
-      <w:r>
-        <w:rPr>
-          <w:rFonts w:ascii="Times New Roman" w:hAnsi="Times New Roman" w:cs="Times New Roman"/>
-          <w:b/>
-          <w:bCs w:val="1"/>
-          <w:i w:val="0"/>
-          <w:color w:val="555555"/>
-          <w:sz w:val="19"/>
-          <w:szCs w:val="19"/>
-        </w:rPr>
-        <w:t xml:space="preserve">Figure 3. </w:t>
-      </w:r>
-      <w:r>
-        <w:rPr>
-          <w:rFonts w:ascii="Times New Roman" w:hAnsi="Times New Roman" w:cs="Times New Roman"/>
-          <w:b w:val="0"/>
-          <w:i/>
-          <w:iCs w:val="1"/>
-          <w:color w:val="555555"/>
-          <w:sz w:val="19"/>
-          <w:szCs w:val="19"/>
-        </w:rPr>
-        <w:t>Geometric discrimination of packaging format. Left: two containers of identical labelling and equal volume but differing proportion — the measured separation on which the rule rests. Right: the ratio bands used to assign format across all 4,641 annotations. The bands are definitional rather than discovered: the thresholds assign the class, so their separation is a property of the scheme and not evidence for it.</w:t>
-      </w:r>
-    </w:p>
-    <w:p>
-      <w:pPr>
-        <w:keepNext/>
-        <w:spacing w:before="360" w:after="140"/>
-        <w:jc w:val="left"/>
-      </w:pPr>
-      <w:r>
-        <w:rPr>
-          <w:rFonts w:ascii="Times New Roman" w:hAnsi="Times New Roman" w:cs="Times New Roman"/>
-          <w:b/>
-          <w:bCs w:val="1"/>
-          <w:i w:val="0"/>
-          <w:color w:val="1A3A5C"/>
-          <w:sz w:val="28"/>
-          <w:szCs w:val="28"/>
-        </w:rPr>
-        <w:t>7. Data Quality Factors in Uncontrolled Imagery</w:t>
-      </w:r>
-    </w:p>
-    <w:p>
-      <w:pPr>
-        <w:keepNext w:val="0"/>
-        <w:spacing w:after="160" w:before="0" w:line="348" w:lineRule="auto"/>
-        <w:jc w:val="both"/>
-      </w:pPr>
-      <w:r>
-        <w:rPr>
-          <w:rFonts w:ascii="Times New Roman" w:hAnsi="Times New Roman" w:cs="Times New Roman"/>
-          <w:b w:val="0"/>
-          <w:i w:val="0"/>
-          <w:color w:val="111111"/>
-          <w:sz w:val="23"/>
-          <w:szCs w:val="23"/>
-        </w:rPr>
-        <w:t>Because the aspect-ratio signal derives from the geometry of the annotated box, its reliability depends directly on the fidelity of that box to the real object. Several failure modes were catalogued during the training, each degrading this fidelity in a distinct way.</w:t>
-      </w:r>
-    </w:p>
-    <w:p>
-      <w:pPr>
-        <w:keepNext w:val="0"/>
-        <w:spacing w:after="120" w:before="0" w:line="348" w:lineRule="auto"/>
-        <w:jc w:val="both"/>
-      </w:pPr>
-      <w:r>
-        <w:rPr>
-          <w:rFonts w:ascii="Times New Roman" w:hAnsi="Times New Roman" w:cs="Times New Roman"/>
-          <w:b w:val="0"/>
-          <w:i w:val="0"/>
-          <w:color w:val="111111"/>
-          <w:sz w:val="23"/>
-          <w:szCs w:val="23"/>
-        </w:rPr>
-        <w:t>Truncation. Objects intersecting the frame boundary, and close-up photographs in which the container extends beyond the visible area, produce partial boxes. The measured height is then a lower bound rather than a measurement, and a sleek can may read as standard. This mode is not merely theoretical: it accounted for 4.2% of the corpus and required an explicit guard in the implemented decision rule.</w:t>
-      </w:r>
-    </w:p>
-    <w:p>
-      <w:pPr>
-        <w:keepNext w:val="0"/>
-        <w:spacing w:after="120" w:before="0" w:line="348" w:lineRule="auto"/>
-        <w:jc w:val="both"/>
-      </w:pPr>
-      <w:r>
-        <w:rPr>
-          <w:rFonts w:ascii="Times New Roman" w:hAnsi="Times New Roman" w:cs="Times New Roman"/>
-          <w:b w:val="0"/>
-          <w:i w:val="0"/>
-          <w:color w:val="111111"/>
-          <w:sz w:val="23"/>
-          <w:szCs w:val="23"/>
-        </w:rPr>
-        <w:t>Perspective distortion. A container photographed from an oblique angle or from above projects onto the image plane with altered proportions, so the same physical product can yield materially different aspect ratios across viewpoints.</w:t>
-      </w:r>
-    </w:p>
-    <w:p>
-      <w:pPr>
-        <w:keepNext w:val="0"/>
-        <w:spacing w:after="120" w:before="0" w:line="348" w:lineRule="auto"/>
-        <w:jc w:val="both"/>
-      </w:pPr>
-      <w:r>
-        <w:rPr>
-          <w:rFonts w:ascii="Times New Roman" w:hAnsi="Times New Roman" w:cs="Times New Roman"/>
-          <w:b w:val="0"/>
-          <w:i w:val="0"/>
-          <w:color w:val="111111"/>
-          <w:sz w:val="23"/>
-          <w:szCs w:val="23"/>
-        </w:rPr>
-        <w:t>Occlusion and dense packing. Products arranged in tight rows partially obscure one another, making boundaries ambiguous and occasionally causing a single box to enclose portions of two adjacent units.</w:t>
-      </w:r>
-    </w:p>
-    <w:p>
-      <w:pPr>
-        <w:keepNext w:val="0"/>
-        <w:spacing w:after="120" w:before="0" w:line="348" w:lineRule="auto"/>
-        <w:jc w:val="both"/>
-      </w:pPr>
-      <w:r>
-        <w:rPr>
-          <w:rFonts w:ascii="Times New Roman" w:hAnsi="Times New Roman" w:cs="Times New Roman"/>
-          <w:b w:val="0"/>
-          <w:i w:val="0"/>
-          <w:color w:val="111111"/>
-          <w:sz w:val="23"/>
-          <w:szCs w:val="23"/>
-        </w:rPr>
-        <w:t>Specular reflection. The reflective metal surfaces of beverage cans scatter light and blur perceived edges, reducing the precision with which boundaries can be placed.</w:t>
-      </w:r>
-    </w:p>
-    <w:p>
-      <w:pPr>
-        <w:keepNext w:val="0"/>
-        <w:spacing w:after="120" w:before="0" w:line="348" w:lineRule="auto"/>
-        <w:jc w:val="both"/>
-      </w:pPr>
-      <w:r>
-        <w:rPr>
-          <w:rFonts w:ascii="Times New Roman" w:hAnsi="Times New Roman" w:cs="Times New Roman"/>
-          <w:b w:val="0"/>
-          <w:i w:val="0"/>
-          <w:color w:val="111111"/>
-          <w:sz w:val="23"/>
-          <w:szCs w:val="23"/>
-        </w:rPr>
-        <w:t>Inherited annotation error. Where an original box was drawn loosely or tightly relative to the true product outline, any geometric quantity derived from it inherits that error unchanged.</w:t>
-      </w:r>
-    </w:p>
-    <w:p>
-      <w:pPr>
-        <w:keepNext w:val="0"/>
-        <w:spacing w:after="160" w:before="0" w:line="348" w:lineRule="auto"/>
-        <w:jc w:val="both"/>
-      </w:pPr>
-      <w:r>
-        <w:rPr>
-          <w:rFonts w:ascii="Times New Roman" w:hAnsi="Times New Roman" w:cs="Times New Roman"/>
-          <w:b w:val="0"/>
-          <w:i w:val="0"/>
-          <w:color w:val="111111"/>
-          <w:sz w:val="23"/>
-          <w:szCs w:val="23"/>
-        </w:rPr>
-        <w:t>A methodological principle follows directly: when geometric evidence is compromised, the correct outcome is an explicit deferral rather than a low-confidence guess, since a wrong label propagates silently into downstream commercial reporting. This principle was implemented literally — the geometric rule declines to judge any box touching the frame edge, leaving the classifier's original label in place — and it motivated the human verification interface described in Section 10.</w:t>
-      </w:r>
-    </w:p>
-    <w:p>
-      <w:pPr>
-        <w:keepNext/>
-        <w:spacing w:before="360" w:after="140"/>
-        <w:jc w:val="left"/>
-      </w:pPr>
-      <w:r>
-        <w:rPr>
-          <w:rFonts w:ascii="Times New Roman" w:hAnsi="Times New Roman" w:cs="Times New Roman"/>
-          <w:b/>
-          <w:bCs w:val="1"/>
-          <w:i w:val="0"/>
-          <w:color w:val="1A3A5C"/>
-          <w:sz w:val="28"/>
-          <w:szCs w:val="28"/>
-        </w:rPr>
-        <w:t>8. Hierarchical Pipeline Architecture</w:t>
-      </w:r>
-    </w:p>
-    <w:p>
-      <w:pPr>
-        <w:keepNext w:val="0"/>
-        <w:spacing w:after="160" w:before="0" w:line="348" w:lineRule="auto"/>
-        <w:jc w:val="both"/>
-      </w:pPr>
-      <w:r>
-        <w:rPr>
-          <w:rFonts w:ascii="Times New Roman" w:hAnsi="Times New Roman" w:cs="Times New Roman"/>
-          <w:b w:val="0"/>
-          <w:i w:val="0"/>
-          <w:color w:val="111111"/>
-          <w:sz w:val="23"/>
-          <w:szCs w:val="23"/>
-        </w:rPr>
-        <w:t>The concepts above compose into a three-stage architecture in which each stage narrows the decision space presented to the next.</w:t>
-      </w:r>
-    </w:p>
-    <w:p>
-      <w:pPr>
-        <w:keepNext w:val="0"/>
-        <w:spacing w:after="160" w:before="0" w:line="348" w:lineRule="auto"/>
-        <w:jc w:val="both"/>
-      </w:pPr>
-      <w:r>
-        <w:rPr>
-          <w:rFonts w:ascii="Times New Roman" w:hAnsi="Times New Roman" w:cs="Times New Roman"/>
-          <w:b w:val="0"/>
-          <w:i w:val="0"/>
-          <w:color w:val="111111"/>
-          <w:sz w:val="23"/>
-          <w:szCs w:val="23"/>
-        </w:rPr>
-        <w:t>Stage One, class-agnostic detection, locates every product on the shelf under a single generic class, producing bounding boxes, unit counts, spatial positions, and the geometric measurements required later. Stage Two, manufacturer classification, matches each cropped region to a manufacturer by embedding similarity; this layer is small and stable, since the set of manufacturers in a market changes far more slowly than the set of products, making it well suited to a training-free approach. Stage Three, product and format classification, operates within the narrowed candidate set established by Stage Two: a trained classifier resolves the specific brand variant while bounding-box geometry resolves the packaging format.</w:t>
-      </w:r>
-    </w:p>
-    <w:p>
-      <w:pPr>
-        <w:keepNext w:val="0"/>
-        <w:spacing w:after="160" w:before="0" w:line="348" w:lineRule="auto"/>
-        <w:jc w:val="both"/>
-      </w:pPr>
-      <w:r>
-        <w:rPr>
-          <w:rFonts w:ascii="Times New Roman" w:hAnsi="Times New Roman" w:cs="Times New Roman"/>
-          <w:b w:val="0"/>
-          <w:i w:val="0"/>
-          <w:color w:val="111111"/>
-          <w:sz w:val="23"/>
-          <w:szCs w:val="23"/>
-        </w:rPr>
-        <w:t>Restricting comparison to one manufacturer's catalogue rather than the entire market materially reduces visual confusion between candidates. It should be noted that all stages after the first are classification operations: the pipeline is detect, then classify, then classify — not repeated detection. Localization is computed once and reused, since spatial coordinates do not change between stages.</w:t>
-      </w:r>
-    </w:p>
-    <w:p>
-      <w:pPr>
-        <w:keepNext w:val="0"/>
-        <w:spacing w:after="160" w:before="0" w:line="348" w:lineRule="auto"/>
-        <w:jc w:val="both"/>
-      </w:pPr>
-      <w:r>
-        <w:rPr>
-          <w:rFonts w:ascii="Times New Roman" w:hAnsi="Times New Roman" w:cs="Times New Roman"/>
-          <w:b w:val="0"/>
-          <w:i w:val="0"/>
-          <w:color w:val="111111"/>
-          <w:sz w:val="23"/>
-          <w:szCs w:val="23"/>
-        </w:rPr>
-        <w:t>A representative class hierarchy illustrates the separation of concerns. Stage One assigns product; Stage Two assigns coca-cola; Stage Three assigns the full SKU identifier, where the visual classifier supplies the brand variant and the geometric rule supplies the format distinction.</w:t>
-      </w:r>
-    </w:p>
-    <w:p>
-      <w:pPr>
-        <w:keepNext/>
-        <w:spacing w:before="240" w:after="80"/>
-        <w:jc w:val="center"/>
-      </w:pPr>
-      <w:r>
-        <w:drawing>
-          <wp:inline xmlns:a="http://schemas.openxmlformats.org/drawingml/2006/main" xmlns:pic="http://schemas.openxmlformats.org/drawingml/2006/picture">
-            <wp:extent cx="5544000" cy="2895200"/>
-            <wp:docPr id="4" name="Picture 4"/>
-            <wp:cNvGraphicFramePr>
-              <a:graphicFrameLocks noChangeAspect="1"/>
-            </wp:cNvGraphicFramePr>
-            <a:graphic>
-              <a:graphicData uri="http://schemas.openxmlformats.org/drawingml/2006/picture">
-                <pic:pic>
-                  <pic:nvPicPr>
-                    <pic:cNvPr id="0" name="fig3_pipeline.png"/>
-                    <pic:cNvPicPr/>
-                  </pic:nvPicPr>
-                  <pic:blipFill>
-                    <a:blip r:embed="rId12"/>
-                    <a:stretch>
-                      <a:fillRect/>
-                    </a:stretch>
-                  </pic:blipFill>
-                  <pic:spPr>
-                    <a:xfrm>
-                      <a:off x="0" y="0"/>
-                      <a:ext cx="5544000" cy="2895200"/>
-                    </a:xfrm>
-                    <a:prstGeom prst="rect"/>
-                  </pic:spPr>
-                </pic:pic>
-              </a:graphicData>
-            </a:graphic>
-          </wp:inline>
-        </w:drawing>
-      </w:r>
-    </w:p>
-    <w:p>
-      <w:pPr>
-        <w:spacing w:after="280"/>
-        <w:jc w:val="center"/>
-      </w:pPr>
-      <w:r>
-        <w:rPr>
-          <w:rFonts w:ascii="Times New Roman" w:hAnsi="Times New Roman" w:cs="Times New Roman"/>
-          <w:b/>
-          <w:bCs w:val="1"/>
-          <w:i w:val="0"/>
-          <w:color w:val="555555"/>
-          <w:sz w:val="19"/>
-          <w:szCs w:val="19"/>
-        </w:rPr>
-        <w:t xml:space="preserve">Figure 4. </w:t>
-      </w:r>
-      <w:r>
-        <w:rPr>
-          <w:rFonts w:ascii="Times New Roman" w:hAnsi="Times New Roman" w:cs="Times New Roman"/>
-          <w:b w:val="0"/>
-          <w:i/>
-          <w:iCs w:val="1"/>
-          <w:color w:val="555555"/>
-          <w:sz w:val="19"/>
-          <w:szCs w:val="19"/>
-        </w:rPr>
-        <w:t>Block diagram of the three-stage pipeline, showing the flow from raw shelf image through class-agnostic detection, region cropping, manufacturer classification, and the fusion of visual and geometric evidence at SKU level.</w:t>
-      </w:r>
-    </w:p>
-    <w:p>
-      <w:pPr>
-        <w:keepNext/>
-        <w:spacing w:before="360" w:after="140"/>
-        <w:jc w:val="left"/>
-      </w:pPr>
-      <w:r>
-        <w:rPr>
-          <w:rFonts w:ascii="Times New Roman" w:hAnsi="Times New Roman" w:cs="Times New Roman"/>
-          <w:b/>
-          <w:bCs w:val="1"/>
-          <w:i w:val="0"/>
-          <w:color w:val="1A3A5C"/>
-          <w:sz w:val="28"/>
-          <w:szCs w:val="28"/>
-        </w:rPr>
-        <w:t>9. Platform Implementation</w:t>
-      </w:r>
-    </w:p>
-    <w:p>
-      <w:pPr>
-        <w:keepNext w:val="0"/>
-        <w:spacing w:after="160" w:before="0" w:line="348" w:lineRule="auto"/>
-        <w:jc w:val="both"/>
-      </w:pPr>
-      <w:r>
-        <w:rPr>
-          <w:rFonts w:ascii="Times New Roman" w:hAnsi="Times New Roman" w:cs="Times New Roman"/>
-          <w:b w:val="0"/>
-          <w:i w:val="0"/>
-          <w:color w:val="111111"/>
-          <w:sz w:val="23"/>
-          <w:szCs w:val="23"/>
-        </w:rPr>
-        <w:t>The proposed architecture was mapped onto Roboflow Workflows, the platform in operational use. Verification against the platform documentation confirmed that every required component exists natively, with a single exception.</w:t>
+        <w:t>The original brand-classed detector and the current class-agnostic detector were compared at their most mature, most fairly matched versions — both trained on the same model architecture (RF-DETR-large) — rather than against an early, undertrained snapshot of either.</w:t>
       </w:r>
     </w:p>
     <w:p>
@@ -1433,1292 +687,7 @@
           <w:sz w:val="19"/>
           <w:szCs w:val="19"/>
         </w:rPr>
-        <w:t>Mapping of pipeline stages onto native platform components.</w:t>
-      </w:r>
-    </w:p>
-    <w:tbl>
-      <w:tblPr>
-        <w:tblStyle w:val="TableGrid"/>
-        <w:tblW w:type="auto" w:w="0"/>
-        <w:jc w:val="left"/>
-        <w:tblLook w:firstColumn="1" w:firstRow="1" w:lastColumn="0" w:lastRow="0" w:noHBand="0" w:noVBand="1" w:val="04A0"/>
-      </w:tblPr>
-      <w:tblGrid>
-        <w:gridCol w:w="2986"/>
-        <w:gridCol w:w="2986"/>
-        <w:gridCol w:w="2986"/>
-      </w:tblGrid>
-      <w:tr>
-        <w:tc>
-          <w:tcPr>
-            <w:tcW w:type="dxa" w:w="2986"/>
-          </w:tcPr>
-          <w:p>
-            <w:pPr>
-              <w:spacing w:before="60" w:after="60"/>
-              <w:jc w:val="left"/>
-            </w:pPr>
-            <w:r/>
-            <w:r>
-              <w:rPr>
-                <w:rFonts w:ascii="Times New Roman" w:hAnsi="Times New Roman" w:cs="Times New Roman"/>
-                <w:b/>
-                <w:bCs w:val="1"/>
-                <w:i w:val="0"/>
-                <w:color w:val="111111"/>
-                <w:sz w:val="20"/>
-                <w:szCs w:val="20"/>
-              </w:rPr>
-              <w:t>Pipeline function</w:t>
-            </w:r>
-          </w:p>
-        </w:tc>
-        <w:tc>
-          <w:tcPr>
-            <w:tcW w:type="dxa" w:w="2986"/>
-          </w:tcPr>
-          <w:p>
-            <w:pPr>
-              <w:spacing w:before="60" w:after="60"/>
-              <w:jc w:val="left"/>
-            </w:pPr>
-            <w:r/>
-            <w:r>
-              <w:rPr>
-                <w:rFonts w:ascii="Times New Roman" w:hAnsi="Times New Roman" w:cs="Times New Roman"/>
-                <w:b/>
-                <w:bCs w:val="1"/>
-                <w:i w:val="0"/>
-                <w:color w:val="111111"/>
-                <w:sz w:val="20"/>
-                <w:szCs w:val="20"/>
-              </w:rPr>
-              <w:t>Platform component</w:t>
-            </w:r>
-          </w:p>
-        </w:tc>
-        <w:tc>
-          <w:tcPr>
-            <w:tcW w:type="dxa" w:w="2986"/>
-          </w:tcPr>
-          <w:p>
-            <w:pPr>
-              <w:spacing w:before="60" w:after="60"/>
-              <w:jc w:val="left"/>
-            </w:pPr>
-            <w:r/>
-            <w:r>
-              <w:rPr>
-                <w:rFonts w:ascii="Times New Roman" w:hAnsi="Times New Roman" w:cs="Times New Roman"/>
-                <w:b/>
-                <w:bCs w:val="1"/>
-                <w:i w:val="0"/>
-                <w:color w:val="111111"/>
-                <w:sz w:val="20"/>
-                <w:szCs w:val="20"/>
-              </w:rPr>
-              <w:t>Training required</w:t>
-            </w:r>
-          </w:p>
-        </w:tc>
-      </w:tr>
-      <w:tr>
-        <w:tc>
-          <w:tcPr>
-            <w:tcW w:type="dxa" w:w="2986"/>
-          </w:tcPr>
-          <w:p>
-            <w:pPr>
-              <w:spacing w:before="60" w:after="60"/>
-              <w:jc w:val="left"/>
-            </w:pPr>
-            <w:r/>
-            <w:r>
-              <w:rPr>
-                <w:rFonts w:ascii="Times New Roman" w:hAnsi="Times New Roman" w:cs="Times New Roman"/>
-                <w:b w:val="0"/>
-                <w:i w:val="0"/>
-                <w:color w:val="111111"/>
-                <w:sz w:val="20"/>
-                <w:szCs w:val="20"/>
-              </w:rPr>
-              <w:t>Class-agnostic detection</w:t>
-            </w:r>
-          </w:p>
-        </w:tc>
-        <w:tc>
-          <w:tcPr>
-            <w:tcW w:type="dxa" w:w="2986"/>
-          </w:tcPr>
-          <w:p>
-            <w:pPr>
-              <w:spacing w:before="60" w:after="60"/>
-              <w:jc w:val="left"/>
-            </w:pPr>
-            <w:r/>
-            <w:r>
-              <w:rPr>
-                <w:rFonts w:ascii="Times New Roman" w:hAnsi="Times New Roman" w:cs="Times New Roman"/>
-                <w:b w:val="0"/>
-                <w:i w:val="0"/>
-                <w:color w:val="111111"/>
-                <w:sz w:val="20"/>
-                <w:szCs w:val="20"/>
-              </w:rPr>
-              <w:t>Object Detection Model</w:t>
-            </w:r>
-          </w:p>
-        </w:tc>
-        <w:tc>
-          <w:tcPr>
-            <w:tcW w:type="dxa" w:w="2986"/>
-          </w:tcPr>
-          <w:p>
-            <w:pPr>
-              <w:spacing w:before="60" w:after="60"/>
-              <w:jc w:val="left"/>
-            </w:pPr>
-            <w:r/>
-            <w:r>
-              <w:rPr>
-                <w:rFonts w:ascii="Times New Roman" w:hAnsi="Times New Roman" w:cs="Times New Roman"/>
-                <w:b w:val="0"/>
-                <w:i w:val="0"/>
-                <w:color w:val="111111"/>
-                <w:sz w:val="20"/>
-                <w:szCs w:val="20"/>
-              </w:rPr>
-              <w:t>Yes</w:t>
-            </w:r>
-          </w:p>
-        </w:tc>
-      </w:tr>
-      <w:tr>
-        <w:tc>
-          <w:tcPr>
-            <w:tcW w:type="dxa" w:w="2986"/>
-          </w:tcPr>
-          <w:p>
-            <w:pPr>
-              <w:spacing w:before="60" w:after="60"/>
-              <w:jc w:val="left"/>
-            </w:pPr>
-            <w:r/>
-            <w:r>
-              <w:rPr>
-                <w:rFonts w:ascii="Times New Roman" w:hAnsi="Times New Roman" w:cs="Times New Roman"/>
-                <w:b w:val="0"/>
-                <w:i w:val="0"/>
-                <w:color w:val="111111"/>
-                <w:sz w:val="20"/>
-                <w:szCs w:val="20"/>
-              </w:rPr>
-              <w:t>Region extraction</w:t>
-            </w:r>
-          </w:p>
-        </w:tc>
-        <w:tc>
-          <w:tcPr>
-            <w:tcW w:type="dxa" w:w="2986"/>
-          </w:tcPr>
-          <w:p>
-            <w:pPr>
-              <w:spacing w:before="60" w:after="60"/>
-              <w:jc w:val="left"/>
-            </w:pPr>
-            <w:r/>
-            <w:r>
-              <w:rPr>
-                <w:rFonts w:ascii="Times New Roman" w:hAnsi="Times New Roman" w:cs="Times New Roman"/>
-                <w:b w:val="0"/>
-                <w:i w:val="0"/>
-                <w:color w:val="111111"/>
-                <w:sz w:val="20"/>
-                <w:szCs w:val="20"/>
-              </w:rPr>
-              <w:t>Dynamic Crop</w:t>
-            </w:r>
-          </w:p>
-        </w:tc>
-        <w:tc>
-          <w:tcPr>
-            <w:tcW w:type="dxa" w:w="2986"/>
-          </w:tcPr>
-          <w:p>
-            <w:pPr>
-              <w:spacing w:before="60" w:after="60"/>
-              <w:jc w:val="left"/>
-            </w:pPr>
-            <w:r/>
-            <w:r>
-              <w:rPr>
-                <w:rFonts w:ascii="Times New Roman" w:hAnsi="Times New Roman" w:cs="Times New Roman"/>
-                <w:b w:val="0"/>
-                <w:i w:val="0"/>
-                <w:color w:val="111111"/>
-                <w:sz w:val="20"/>
-                <w:szCs w:val="20"/>
-              </w:rPr>
-              <w:t>No</w:t>
-            </w:r>
-          </w:p>
-        </w:tc>
-      </w:tr>
-      <w:tr>
-        <w:tc>
-          <w:tcPr>
-            <w:tcW w:type="dxa" w:w="2986"/>
-          </w:tcPr>
-          <w:p>
-            <w:pPr>
-              <w:spacing w:before="60" w:after="60"/>
-              <w:jc w:val="left"/>
-            </w:pPr>
-            <w:r/>
-            <w:r>
-              <w:rPr>
-                <w:rFonts w:ascii="Times New Roman" w:hAnsi="Times New Roman" w:cs="Times New Roman"/>
-                <w:b w:val="0"/>
-                <w:i w:val="0"/>
-                <w:color w:val="111111"/>
-                <w:sz w:val="20"/>
-                <w:szCs w:val="20"/>
-              </w:rPr>
-              <w:t>Manufacturer classification</w:t>
-            </w:r>
-          </w:p>
-        </w:tc>
-        <w:tc>
-          <w:tcPr>
-            <w:tcW w:type="dxa" w:w="2986"/>
-          </w:tcPr>
-          <w:p>
-            <w:pPr>
-              <w:spacing w:before="60" w:after="60"/>
-              <w:jc w:val="left"/>
-            </w:pPr>
-            <w:r/>
-            <w:r>
-              <w:rPr>
-                <w:rFonts w:ascii="Times New Roman" w:hAnsi="Times New Roman" w:cs="Times New Roman"/>
-                <w:b w:val="0"/>
-                <w:i w:val="0"/>
-                <w:color w:val="111111"/>
-                <w:sz w:val="20"/>
-                <w:szCs w:val="20"/>
-              </w:rPr>
-              <w:t>CLIP Comparison</w:t>
-            </w:r>
-          </w:p>
-        </w:tc>
-        <w:tc>
-          <w:tcPr>
-            <w:tcW w:type="dxa" w:w="2986"/>
-          </w:tcPr>
-          <w:p>
-            <w:pPr>
-              <w:spacing w:before="60" w:after="60"/>
-              <w:jc w:val="left"/>
-            </w:pPr>
-            <w:r/>
-            <w:r>
-              <w:rPr>
-                <w:rFonts w:ascii="Times New Roman" w:hAnsi="Times New Roman" w:cs="Times New Roman"/>
-                <w:b w:val="0"/>
-                <w:i w:val="0"/>
-                <w:color w:val="111111"/>
-                <w:sz w:val="20"/>
-                <w:szCs w:val="20"/>
-              </w:rPr>
-              <w:t>No (zero-shot)</w:t>
-            </w:r>
-          </w:p>
-        </w:tc>
-      </w:tr>
-      <w:tr>
-        <w:tc>
-          <w:tcPr>
-            <w:tcW w:type="dxa" w:w="2986"/>
-          </w:tcPr>
-          <w:p>
-            <w:pPr>
-              <w:spacing w:before="60" w:after="60"/>
-              <w:jc w:val="left"/>
-            </w:pPr>
-            <w:r/>
-            <w:r>
-              <w:rPr>
-                <w:rFonts w:ascii="Times New Roman" w:hAnsi="Times New Roman" w:cs="Times New Roman"/>
-                <w:b w:val="0"/>
-                <w:i w:val="0"/>
-                <w:color w:val="111111"/>
-                <w:sz w:val="20"/>
-                <w:szCs w:val="20"/>
-              </w:rPr>
-              <w:t>Product / variant classification</w:t>
-            </w:r>
-          </w:p>
-        </w:tc>
-        <w:tc>
-          <w:tcPr>
-            <w:tcW w:type="dxa" w:w="2986"/>
-          </w:tcPr>
-          <w:p>
-            <w:pPr>
-              <w:spacing w:before="60" w:after="60"/>
-              <w:jc w:val="left"/>
-            </w:pPr>
-            <w:r/>
-            <w:r>
-              <w:rPr>
-                <w:rFonts w:ascii="Times New Roman" w:hAnsi="Times New Roman" w:cs="Times New Roman"/>
-                <w:b w:val="0"/>
-                <w:i w:val="0"/>
-                <w:color w:val="111111"/>
-                <w:sz w:val="20"/>
-                <w:szCs w:val="20"/>
-              </w:rPr>
-              <w:t>Single-Label Classification Model</w:t>
-            </w:r>
-          </w:p>
-        </w:tc>
-        <w:tc>
-          <w:tcPr>
-            <w:tcW w:type="dxa" w:w="2986"/>
-          </w:tcPr>
-          <w:p>
-            <w:pPr>
-              <w:spacing w:before="60" w:after="60"/>
-              <w:jc w:val="left"/>
-            </w:pPr>
-            <w:r/>
-            <w:r>
-              <w:rPr>
-                <w:rFonts w:ascii="Times New Roman" w:hAnsi="Times New Roman" w:cs="Times New Roman"/>
-                <w:b w:val="0"/>
-                <w:i w:val="0"/>
-                <w:color w:val="111111"/>
-                <w:sz w:val="20"/>
-                <w:szCs w:val="20"/>
-              </w:rPr>
-              <w:t>Yes</w:t>
-            </w:r>
-          </w:p>
-        </w:tc>
-      </w:tr>
-      <w:tr>
-        <w:tc>
-          <w:tcPr>
-            <w:tcW w:type="dxa" w:w="2986"/>
-          </w:tcPr>
-          <w:p>
-            <w:pPr>
-              <w:spacing w:before="60" w:after="60"/>
-              <w:jc w:val="left"/>
-            </w:pPr>
-            <w:r/>
-            <w:r>
-              <w:rPr>
-                <w:rFonts w:ascii="Times New Roman" w:hAnsi="Times New Roman" w:cs="Times New Roman"/>
-                <w:b w:val="0"/>
-                <w:i w:val="0"/>
-                <w:color w:val="111111"/>
-                <w:sz w:val="20"/>
-                <w:szCs w:val="20"/>
-              </w:rPr>
-              <w:t>Format discrimination by geometry</w:t>
-            </w:r>
-          </w:p>
-        </w:tc>
-        <w:tc>
-          <w:tcPr>
-            <w:tcW w:type="dxa" w:w="2986"/>
-          </w:tcPr>
-          <w:p>
-            <w:pPr>
-              <w:spacing w:before="60" w:after="60"/>
-              <w:jc w:val="left"/>
-            </w:pPr>
-            <w:r/>
-            <w:r>
-              <w:rPr>
-                <w:rFonts w:ascii="Times New Roman" w:hAnsi="Times New Roman" w:cs="Times New Roman"/>
-                <w:b w:val="0"/>
-                <w:i w:val="0"/>
-                <w:color w:val="111111"/>
-                <w:sz w:val="20"/>
-                <w:szCs w:val="20"/>
-              </w:rPr>
-              <w:t>Dynamic Python Block</w:t>
-            </w:r>
-          </w:p>
-        </w:tc>
-        <w:tc>
-          <w:tcPr>
-            <w:tcW w:type="dxa" w:w="2986"/>
-          </w:tcPr>
-          <w:p>
-            <w:pPr>
-              <w:spacing w:before="60" w:after="60"/>
-              <w:jc w:val="left"/>
-            </w:pPr>
-            <w:r/>
-            <w:r>
-              <w:rPr>
-                <w:rFonts w:ascii="Times New Roman" w:hAnsi="Times New Roman" w:cs="Times New Roman"/>
-                <w:b w:val="0"/>
-                <w:i w:val="0"/>
-                <w:color w:val="111111"/>
-                <w:sz w:val="20"/>
-                <w:szCs w:val="20"/>
-              </w:rPr>
-              <w:t>No (rule-based)</w:t>
-            </w:r>
-          </w:p>
-        </w:tc>
-      </w:tr>
-    </w:tbl>
-    <w:p>
-      <w:pPr>
-        <w:spacing w:after="200" w:before="0"/>
-      </w:pPr>
-    </w:p>
-    <w:p>
-      <w:pPr>
-        <w:keepNext w:val="0"/>
-        <w:spacing w:after="160" w:before="0" w:line="348" w:lineRule="auto"/>
-        <w:jc w:val="both"/>
-      </w:pPr>
-      <w:r>
-        <w:rPr>
-          <w:rFonts w:ascii="Times New Roman" w:hAnsi="Times New Roman" w:cs="Times New Roman"/>
-          <w:b w:val="0"/>
-          <w:i w:val="0"/>
-          <w:color w:val="111111"/>
-          <w:sz w:val="23"/>
-          <w:szCs w:val="23"/>
-        </w:rPr>
-        <w:t>The geometric decision rule is the only component without a ready-made equivalent. It is implemented through a Dynamic Python Block, which permits custom logic to consume the outputs of preceding blocks — reading bounding-box dimensions and applying the aspect-ratio threshold separating packaging formats. This represents a small quantity of code rather than an additional trained model. In the delivered application the same rule is implemented client-side, demonstrating that the fusion step is portable across execution contexts.</w:t>
-      </w:r>
-    </w:p>
-    <w:p>
-      <w:pPr>
-        <w:keepNext w:val="0"/>
-        <w:spacing w:after="160" w:before="0" w:line="348" w:lineRule="auto"/>
-        <w:jc w:val="both"/>
-      </w:pPr>
-      <w:r>
-        <w:rPr>
-          <w:rFonts w:ascii="Times New Roman" w:hAnsi="Times New Roman" w:cs="Times New Roman"/>
-          <w:b w:val="0"/>
-          <w:i w:val="0"/>
-          <w:color w:val="111111"/>
-          <w:sz w:val="23"/>
-          <w:szCs w:val="23"/>
-        </w:rPr>
-        <w:t>The workflow additionally exposes runtime parameters — confidence threshold, intersection-over-union threshold, class-agnostic non-maximum suppression, maximum detection count, and model version — which the application surfaces to the operator, so that detection behaviour can be tuned in the field without redeployment.</w:t>
-      </w:r>
-    </w:p>
-    <w:p>
-      <w:pPr>
-        <w:keepNext/>
-        <w:spacing w:before="360" w:after="140"/>
-        <w:jc w:val="left"/>
-      </w:pPr>
-      <w:r>
-        <w:rPr>
-          <w:rFonts w:ascii="Times New Roman" w:hAnsi="Times New Roman" w:cs="Times New Roman"/>
-          <w:b/>
-          <w:bCs w:val="1"/>
-          <w:i w:val="0"/>
-          <w:color w:val="1A3A5C"/>
-          <w:sz w:val="28"/>
-          <w:szCs w:val="28"/>
-        </w:rPr>
-        <w:t>10. Field Data Collection Application</w:t>
-      </w:r>
-    </w:p>
-    <w:p>
-      <w:pPr>
-        <w:keepNext w:val="0"/>
-        <w:spacing w:after="160" w:before="0" w:line="348" w:lineRule="auto"/>
-        <w:jc w:val="both"/>
-      </w:pPr>
-      <w:r>
-        <w:rPr>
-          <w:rFonts w:ascii="Times New Roman" w:hAnsi="Times New Roman" w:cs="Times New Roman"/>
-          <w:b w:val="0"/>
-          <w:i w:val="0"/>
-          <w:color w:val="111111"/>
-          <w:sz w:val="23"/>
-          <w:szCs w:val="23"/>
-        </w:rPr>
-        <w:t>A recurring theme of the analysis is that model output on uncontrolled imagery cannot be treated as final: ambiguous cases arise structurally, not incidentally. A cross-platform application was therefore developed in Flutter to serve three roles — standardising field capture at the point of collection, running the analysis pipeline against the captured image, and interposing human verification between model inference and committed data.</w:t>
-      </w:r>
-    </w:p>
-    <w:p>
-      <w:pPr>
-        <w:keepNext w:val="0"/>
-        <w:spacing w:after="160" w:before="0" w:line="348" w:lineRule="auto"/>
-        <w:jc w:val="both"/>
-      </w:pPr>
-      <w:r>
-        <w:rPr>
-          <w:rFonts w:ascii="Times New Roman" w:hAnsi="Times New Roman" w:cs="Times New Roman"/>
-          <w:b w:val="0"/>
-          <w:i w:val="0"/>
-          <w:color w:val="111111"/>
-          <w:sz w:val="23"/>
-          <w:szCs w:val="23"/>
-        </w:rPr>
-        <w:t>The delivered application comprises 60 Dart source files totalling approximately 10,800 lines, organised into six layers, and is accompanied by 20 test files totalling approximately 4,100 lines.</w:t>
-      </w:r>
-    </w:p>
-    <w:p>
-      <w:pPr>
-        <w:keepNext/>
-        <w:spacing w:before="240" w:after="100"/>
-        <w:jc w:val="center"/>
-      </w:pPr>
-      <w:r>
-        <w:rPr>
-          <w:rFonts w:ascii="Times New Roman" w:hAnsi="Times New Roman" w:cs="Times New Roman"/>
-          <w:b/>
-          <w:bCs w:val="1"/>
-          <w:i w:val="0"/>
-          <w:color w:val="555555"/>
-          <w:sz w:val="19"/>
-          <w:szCs w:val="19"/>
-        </w:rPr>
-        <w:t xml:space="preserve">Table 2. </w:t>
-      </w:r>
-      <w:r>
-        <w:rPr>
-          <w:rFonts w:ascii="Times New Roman" w:hAnsi="Times New Roman" w:cs="Times New Roman"/>
-          <w:b w:val="0"/>
-          <w:i/>
-          <w:iCs w:val="1"/>
-          <w:color w:val="555555"/>
-          <w:sz w:val="19"/>
-          <w:szCs w:val="19"/>
-        </w:rPr>
-        <w:t>Composition of the delivered application by architectural layer.</w:t>
-      </w:r>
-    </w:p>
-    <w:tbl>
-      <w:tblPr>
-        <w:tblStyle w:val="TableGrid"/>
-        <w:tblW w:type="auto" w:w="0"/>
-        <w:jc w:val="left"/>
-        <w:tblLook w:firstColumn="1" w:firstRow="1" w:lastColumn="0" w:lastRow="0" w:noHBand="0" w:noVBand="1" w:val="04A0"/>
-      </w:tblPr>
-      <w:tblGrid>
-        <w:gridCol w:w="2986"/>
-        <w:gridCol w:w="2986"/>
-        <w:gridCol w:w="2986"/>
-      </w:tblGrid>
-      <w:tr>
-        <w:tc>
-          <w:tcPr>
-            <w:tcW w:type="dxa" w:w="2986"/>
-          </w:tcPr>
-          <w:p>
-            <w:pPr>
-              <w:spacing w:before="60" w:after="60"/>
-              <w:jc w:val="left"/>
-            </w:pPr>
-            <w:r/>
-            <w:r>
-              <w:rPr>
-                <w:rFonts w:ascii="Times New Roman" w:hAnsi="Times New Roman" w:cs="Times New Roman"/>
-                <w:b/>
-                <w:bCs w:val="1"/>
-                <w:i w:val="0"/>
-                <w:color w:val="111111"/>
-                <w:sz w:val="20"/>
-                <w:szCs w:val="20"/>
-              </w:rPr>
-              <w:t>Layer</w:t>
-            </w:r>
-          </w:p>
-        </w:tc>
-        <w:tc>
-          <w:tcPr>
-            <w:tcW w:type="dxa" w:w="2986"/>
-          </w:tcPr>
-          <w:p>
-            <w:pPr>
-              <w:spacing w:before="60" w:after="60"/>
-              <w:jc w:val="left"/>
-            </w:pPr>
-            <w:r/>
-            <w:r>
-              <w:rPr>
-                <w:rFonts w:ascii="Times New Roman" w:hAnsi="Times New Roman" w:cs="Times New Roman"/>
-                <w:b/>
-                <w:bCs w:val="1"/>
-                <w:i w:val="0"/>
-                <w:color w:val="111111"/>
-                <w:sz w:val="20"/>
-                <w:szCs w:val="20"/>
-              </w:rPr>
-              <w:t>Modules</w:t>
-            </w:r>
-          </w:p>
-        </w:tc>
-        <w:tc>
-          <w:tcPr>
-            <w:tcW w:type="dxa" w:w="2986"/>
-          </w:tcPr>
-          <w:p>
-            <w:pPr>
-              <w:spacing w:before="60" w:after="60"/>
-              <w:jc w:val="left"/>
-            </w:pPr>
-            <w:r/>
-            <w:r>
-              <w:rPr>
-                <w:rFonts w:ascii="Times New Roman" w:hAnsi="Times New Roman" w:cs="Times New Roman"/>
-                <w:b/>
-                <w:bCs w:val="1"/>
-                <w:i w:val="0"/>
-                <w:color w:val="111111"/>
-                <w:sz w:val="20"/>
-                <w:szCs w:val="20"/>
-              </w:rPr>
-              <w:t>Responsibility</w:t>
-            </w:r>
-          </w:p>
-        </w:tc>
-      </w:tr>
-      <w:tr>
-        <w:tc>
-          <w:tcPr>
-            <w:tcW w:type="dxa" w:w="2986"/>
-          </w:tcPr>
-          <w:p>
-            <w:pPr>
-              <w:spacing w:before="60" w:after="60"/>
-              <w:jc w:val="left"/>
-            </w:pPr>
-            <w:r/>
-            <w:r>
-              <w:rPr>
-                <w:rFonts w:ascii="Times New Roman" w:hAnsi="Times New Roman" w:cs="Times New Roman"/>
-                <w:b w:val="0"/>
-                <w:i w:val="0"/>
-                <w:color w:val="111111"/>
-                <w:sz w:val="20"/>
-                <w:szCs w:val="20"/>
-              </w:rPr>
-              <w:t>Screens</w:t>
-            </w:r>
-          </w:p>
-        </w:tc>
-        <w:tc>
-          <w:tcPr>
-            <w:tcW w:type="dxa" w:w="2986"/>
-          </w:tcPr>
-          <w:p>
-            <w:pPr>
-              <w:spacing w:before="60" w:after="60"/>
-              <w:jc w:val="left"/>
-            </w:pPr>
-            <w:r/>
-            <w:r>
-              <w:rPr>
-                <w:rFonts w:ascii="Times New Roman" w:hAnsi="Times New Roman" w:cs="Times New Roman"/>
-                <w:b w:val="0"/>
-                <w:i w:val="0"/>
-                <w:color w:val="111111"/>
-                <w:sz w:val="20"/>
-                <w:szCs w:val="20"/>
-              </w:rPr>
-              <w:t>12</w:t>
-            </w:r>
-          </w:p>
-        </w:tc>
-        <w:tc>
-          <w:tcPr>
-            <w:tcW w:type="dxa" w:w="2986"/>
-          </w:tcPr>
-          <w:p>
-            <w:pPr>
-              <w:spacing w:before="60" w:after="60"/>
-              <w:jc w:val="left"/>
-            </w:pPr>
-            <w:r/>
-            <w:r>
-              <w:rPr>
-                <w:rFonts w:ascii="Times New Roman" w:hAnsi="Times New Roman" w:cs="Times New Roman"/>
-                <w:b w:val="0"/>
-                <w:i w:val="0"/>
-                <w:color w:val="111111"/>
-                <w:sz w:val="20"/>
-                <w:szCs w:val="20"/>
-              </w:rPr>
-              <w:t>Authentication, capture, review, administration, visit flow</w:t>
-            </w:r>
-          </w:p>
-        </w:tc>
-      </w:tr>
-      <w:tr>
-        <w:tc>
-          <w:tcPr>
-            <w:tcW w:type="dxa" w:w="2986"/>
-          </w:tcPr>
-          <w:p>
-            <w:pPr>
-              <w:spacing w:before="60" w:after="60"/>
-              <w:jc w:val="left"/>
-            </w:pPr>
-            <w:r/>
-            <w:r>
-              <w:rPr>
-                <w:rFonts w:ascii="Times New Roman" w:hAnsi="Times New Roman" w:cs="Times New Roman"/>
-                <w:b w:val="0"/>
-                <w:i w:val="0"/>
-                <w:color w:val="111111"/>
-                <w:sz w:val="20"/>
-                <w:szCs w:val="20"/>
-              </w:rPr>
-              <w:t>Services</w:t>
-            </w:r>
-          </w:p>
-        </w:tc>
-        <w:tc>
-          <w:tcPr>
-            <w:tcW w:type="dxa" w:w="2986"/>
-          </w:tcPr>
-          <w:p>
-            <w:pPr>
-              <w:spacing w:before="60" w:after="60"/>
-              <w:jc w:val="left"/>
-            </w:pPr>
-            <w:r/>
-            <w:r>
-              <w:rPr>
-                <w:rFonts w:ascii="Times New Roman" w:hAnsi="Times New Roman" w:cs="Times New Roman"/>
-                <w:b w:val="0"/>
-                <w:i w:val="0"/>
-                <w:color w:val="111111"/>
-                <w:sz w:val="20"/>
-                <w:szCs w:val="20"/>
-              </w:rPr>
-              <w:t>14</w:t>
-            </w:r>
-          </w:p>
-        </w:tc>
-        <w:tc>
-          <w:tcPr>
-            <w:tcW w:type="dxa" w:w="2986"/>
-          </w:tcPr>
-          <w:p>
-            <w:pPr>
-              <w:spacing w:before="60" w:after="60"/>
-              <w:jc w:val="left"/>
-            </w:pPr>
-            <w:r/>
-            <w:r>
-              <w:rPr>
-                <w:rFonts w:ascii="Times New Roman" w:hAnsi="Times New Roman" w:cs="Times New Roman"/>
-                <w:b w:val="0"/>
-                <w:i w:val="0"/>
-                <w:color w:val="111111"/>
-                <w:sz w:val="20"/>
-                <w:szCs w:val="20"/>
-              </w:rPr>
-              <w:t>Detection, camera, authentication, market and visit persistence</w:t>
-            </w:r>
-          </w:p>
-        </w:tc>
-      </w:tr>
-      <w:tr>
-        <w:tc>
-          <w:tcPr>
-            <w:tcW w:type="dxa" w:w="2986"/>
-          </w:tcPr>
-          <w:p>
-            <w:pPr>
-              <w:spacing w:before="60" w:after="60"/>
-              <w:jc w:val="left"/>
-            </w:pPr>
-            <w:r/>
-            <w:r>
-              <w:rPr>
-                <w:rFonts w:ascii="Times New Roman" w:hAnsi="Times New Roman" w:cs="Times New Roman"/>
-                <w:b w:val="0"/>
-                <w:i w:val="0"/>
-                <w:color w:val="111111"/>
-                <w:sz w:val="20"/>
-                <w:szCs w:val="20"/>
-              </w:rPr>
-              <w:t>Models</w:t>
-            </w:r>
-          </w:p>
-        </w:tc>
-        <w:tc>
-          <w:tcPr>
-            <w:tcW w:type="dxa" w:w="2986"/>
-          </w:tcPr>
-          <w:p>
-            <w:pPr>
-              <w:spacing w:before="60" w:after="60"/>
-              <w:jc w:val="left"/>
-            </w:pPr>
-            <w:r/>
-            <w:r>
-              <w:rPr>
-                <w:rFonts w:ascii="Times New Roman" w:hAnsi="Times New Roman" w:cs="Times New Roman"/>
-                <w:b w:val="0"/>
-                <w:i w:val="0"/>
-                <w:color w:val="111111"/>
-                <w:sz w:val="20"/>
-                <w:szCs w:val="20"/>
-              </w:rPr>
-              <w:t>13</w:t>
-            </w:r>
-          </w:p>
-        </w:tc>
-        <w:tc>
-          <w:tcPr>
-            <w:tcW w:type="dxa" w:w="2986"/>
-          </w:tcPr>
-          <w:p>
-            <w:pPr>
-              <w:spacing w:before="60" w:after="60"/>
-              <w:jc w:val="left"/>
-            </w:pPr>
-            <w:r/>
-            <w:r>
-              <w:rPr>
-                <w:rFonts w:ascii="Times New Roman" w:hAnsi="Times New Roman" w:cs="Times New Roman"/>
-                <w:b w:val="0"/>
-                <w:i w:val="0"/>
-                <w:color w:val="111111"/>
-                <w:sz w:val="20"/>
-                <w:szCs w:val="20"/>
-              </w:rPr>
-              <w:t>Detections, bounding boxes, shape rules, share-of-shelf, user profiles</w:t>
-            </w:r>
-          </w:p>
-        </w:tc>
-      </w:tr>
-      <w:tr>
-        <w:tc>
-          <w:tcPr>
-            <w:tcW w:type="dxa" w:w="2986"/>
-          </w:tcPr>
-          <w:p>
-            <w:pPr>
-              <w:spacing w:before="60" w:after="60"/>
-              <w:jc w:val="left"/>
-            </w:pPr>
-            <w:r/>
-            <w:r>
-              <w:rPr>
-                <w:rFonts w:ascii="Times New Roman" w:hAnsi="Times New Roman" w:cs="Times New Roman"/>
-                <w:b w:val="0"/>
-                <w:i w:val="0"/>
-                <w:color w:val="111111"/>
-                <w:sz w:val="20"/>
-                <w:szCs w:val="20"/>
-              </w:rPr>
-              <w:t>Widgets</w:t>
-            </w:r>
-          </w:p>
-        </w:tc>
-        <w:tc>
-          <w:tcPr>
-            <w:tcW w:type="dxa" w:w="2986"/>
-          </w:tcPr>
-          <w:p>
-            <w:pPr>
-              <w:spacing w:before="60" w:after="60"/>
-              <w:jc w:val="left"/>
-            </w:pPr>
-            <w:r/>
-            <w:r>
-              <w:rPr>
-                <w:rFonts w:ascii="Times New Roman" w:hAnsi="Times New Roman" w:cs="Times New Roman"/>
-                <w:b w:val="0"/>
-                <w:i w:val="0"/>
-                <w:color w:val="111111"/>
-                <w:sz w:val="20"/>
-                <w:szCs w:val="20"/>
-              </w:rPr>
-              <w:t>17</w:t>
-            </w:r>
-          </w:p>
-        </w:tc>
-        <w:tc>
-          <w:tcPr>
-            <w:tcW w:type="dxa" w:w="2986"/>
-          </w:tcPr>
-          <w:p>
-            <w:pPr>
-              <w:spacing w:before="60" w:after="60"/>
-              <w:jc w:val="left"/>
-            </w:pPr>
-            <w:r/>
-            <w:r>
-              <w:rPr>
-                <w:rFonts w:ascii="Times New Roman" w:hAnsi="Times New Roman" w:cs="Times New Roman"/>
-                <w:b w:val="0"/>
-                <w:i w:val="0"/>
-                <w:color w:val="111111"/>
-                <w:sz w:val="20"/>
-                <w:szCs w:val="20"/>
-              </w:rPr>
-              <w:t>Detection overlays, editors, adaptive layout, result panels</w:t>
-            </w:r>
-          </w:p>
-        </w:tc>
-      </w:tr>
-      <w:tr>
-        <w:tc>
-          <w:tcPr>
-            <w:tcW w:type="dxa" w:w="2986"/>
-          </w:tcPr>
-          <w:p>
-            <w:pPr>
-              <w:spacing w:before="60" w:after="60"/>
-              <w:jc w:val="left"/>
-            </w:pPr>
-            <w:r/>
-            <w:r>
-              <w:rPr>
-                <w:rFonts w:ascii="Times New Roman" w:hAnsi="Times New Roman" w:cs="Times New Roman"/>
-                <w:b w:val="0"/>
-                <w:i w:val="0"/>
-                <w:color w:val="111111"/>
-                <w:sz w:val="20"/>
-                <w:szCs w:val="20"/>
-              </w:rPr>
-              <w:t>Config / Theme</w:t>
-            </w:r>
-          </w:p>
-        </w:tc>
-        <w:tc>
-          <w:tcPr>
-            <w:tcW w:type="dxa" w:w="2986"/>
-          </w:tcPr>
-          <w:p>
-            <w:pPr>
-              <w:spacing w:before="60" w:after="60"/>
-              <w:jc w:val="left"/>
-            </w:pPr>
-            <w:r/>
-            <w:r>
-              <w:rPr>
-                <w:rFonts w:ascii="Times New Roman" w:hAnsi="Times New Roman" w:cs="Times New Roman"/>
-                <w:b w:val="0"/>
-                <w:i w:val="0"/>
-                <w:color w:val="111111"/>
-                <w:sz w:val="20"/>
-                <w:szCs w:val="20"/>
-              </w:rPr>
-              <w:t>4</w:t>
-            </w:r>
-          </w:p>
-        </w:tc>
-        <w:tc>
-          <w:tcPr>
-            <w:tcW w:type="dxa" w:w="2986"/>
-          </w:tcPr>
-          <w:p>
-            <w:pPr>
-              <w:spacing w:before="60" w:after="60"/>
-              <w:jc w:val="left"/>
-            </w:pPr>
-            <w:r/>
-            <w:r>
-              <w:rPr>
-                <w:rFonts w:ascii="Times New Roman" w:hAnsi="Times New Roman" w:cs="Times New Roman"/>
-                <w:b w:val="0"/>
-                <w:i w:val="0"/>
-                <w:color w:val="111111"/>
-                <w:sz w:val="20"/>
-                <w:szCs w:val="20"/>
-              </w:rPr>
-              <w:t>Runtime configuration and presentation tokens</w:t>
-            </w:r>
-          </w:p>
-        </w:tc>
-      </w:tr>
-    </w:tbl>
-    <w:p>
-      <w:pPr>
-        <w:spacing w:after="200" w:before="0"/>
-      </w:pPr>
-    </w:p>
-    <w:p>
-      <w:pPr>
-        <w:keepNext/>
-        <w:spacing w:before="240" w:after="140"/>
-        <w:jc w:val="left"/>
-      </w:pPr>
-      <w:r>
-        <w:rPr>
-          <w:rFonts w:ascii="Times New Roman" w:hAnsi="Times New Roman" w:cs="Times New Roman"/>
-          <w:b/>
-          <w:bCs w:val="1"/>
-          <w:i w:val="0"/>
-          <w:color w:val="1A3A5C"/>
-          <w:sz w:val="24"/>
-          <w:szCs w:val="24"/>
-        </w:rPr>
-        <w:t>10.1 Structured Capture</w:t>
-      </w:r>
-    </w:p>
-    <w:p>
-      <w:pPr>
-        <w:keepNext w:val="0"/>
-        <w:spacing w:after="160" w:before="0" w:line="348" w:lineRule="auto"/>
-        <w:jc w:val="both"/>
-      </w:pPr>
-      <w:r>
-        <w:rPr>
-          <w:rFonts w:ascii="Times New Roman" w:hAnsi="Times New Roman" w:cs="Times New Roman"/>
-          <w:b w:val="0"/>
-          <w:i w:val="0"/>
-          <w:color w:val="111111"/>
-          <w:sz w:val="23"/>
-          <w:szCs w:val="23"/>
-        </w:rPr>
-        <w:t>The application implements a role-differentiated flow. Company administrators define and manage the set of markets under audit and review team access requests; field representatives select a market, capture shelf imagery through a dedicated camera interface with selectable aspect ratio, and persist the result against that market as part of a recorded visit. Binding every image to a known market at capture time ensures that collected data carries the contextual metadata required for downstream commercial analysis, rather than arriving as unattributed photographs.</w:t>
-      </w:r>
-    </w:p>
-    <w:p>
-      <w:pPr>
-        <w:keepNext/>
-        <w:spacing w:before="240" w:after="140"/>
-        <w:jc w:val="left"/>
-      </w:pPr>
-      <w:r>
-        <w:rPr>
-          <w:rFonts w:ascii="Times New Roman" w:hAnsi="Times New Roman" w:cs="Times New Roman"/>
-          <w:b/>
-          <w:bCs w:val="1"/>
-          <w:i w:val="0"/>
-          <w:color w:val="1A3A5C"/>
-          <w:sz w:val="24"/>
-          <w:szCs w:val="24"/>
-        </w:rPr>
-        <w:t>10.2 Human-in-the-Loop Verification</w:t>
-      </w:r>
-    </w:p>
-    <w:p>
-      <w:pPr>
-        <w:keepNext w:val="0"/>
-        <w:spacing w:after="160" w:before="0" w:line="348" w:lineRule="auto"/>
-        <w:jc w:val="both"/>
-      </w:pPr>
-      <w:r>
-        <w:rPr>
-          <w:rFonts w:ascii="Times New Roman" w:hAnsi="Times New Roman" w:cs="Times New Roman"/>
-          <w:b w:val="0"/>
-          <w:i w:val="0"/>
-          <w:color w:val="111111"/>
-          <w:sz w:val="23"/>
-          <w:szCs w:val="23"/>
-        </w:rPr>
-        <w:t>A detection editor allows the operator to review model-produced detections and correct them before submission. This component addresses the failure modes of Section 7 operationally: where truncation, occlusion, or perspective renders an automatic classification unreliable, the operator resolves it rather than allowing a low-confidence label to propagate. The corrections additionally constitute a supervised signal suitable for subsequent retraining, so routine field use generates training data as a by-product of normal operation.</w:t>
-      </w:r>
-    </w:p>
-    <w:p>
-      <w:pPr>
-        <w:keepNext/>
-        <w:spacing w:before="240" w:after="140"/>
-        <w:jc w:val="left"/>
-      </w:pPr>
-      <w:r>
-        <w:rPr>
-          <w:rFonts w:ascii="Times New Roman" w:hAnsi="Times New Roman" w:cs="Times New Roman"/>
-          <w:b/>
-          <w:bCs w:val="1"/>
-          <w:i w:val="0"/>
-          <w:color w:val="1A3A5C"/>
-          <w:sz w:val="24"/>
-          <w:szCs w:val="24"/>
-        </w:rPr>
-        <w:t>10.3 Commercial Measurement</w:t>
-      </w:r>
-    </w:p>
-    <w:p>
-      <w:pPr>
-        <w:keepNext w:val="0"/>
-        <w:spacing w:after="160" w:before="0" w:line="348" w:lineRule="auto"/>
-        <w:jc w:val="both"/>
-      </w:pPr>
-      <w:r>
-        <w:rPr>
-          <w:rFonts w:ascii="Times New Roman" w:hAnsi="Times New Roman" w:cs="Times New Roman"/>
-          <w:b w:val="0"/>
-          <w:i w:val="0"/>
-          <w:color w:val="111111"/>
-          <w:sz w:val="23"/>
-          <w:szCs w:val="23"/>
-        </w:rPr>
-        <w:t>The application converts verified detections into a share-of-shelf measure: for each class, the bounding-box areas are summed and divided by the total detected area across all classes. The measure is deliberately simple and is documented as a relative facing-space proxy rather than a true occupancy measurement, since overlapping boxes are not de-duplicated. Stating that limitation explicitly, rather than presenting the figure as exact, is itself part of the design.</w:t>
-      </w:r>
-    </w:p>
-    <w:p>
-      <w:pPr>
-        <w:keepNext/>
-        <w:spacing w:before="240" w:after="140"/>
-        <w:jc w:val="left"/>
-      </w:pPr>
-      <w:r>
-        <w:rPr>
-          <w:rFonts w:ascii="Times New Roman" w:hAnsi="Times New Roman" w:cs="Times New Roman"/>
-          <w:b/>
-          <w:bCs w:val="1"/>
-          <w:i w:val="0"/>
-          <w:color w:val="1A3A5C"/>
-          <w:sz w:val="24"/>
-          <w:szCs w:val="24"/>
-        </w:rPr>
-        <w:t>10.4 Cross-Platform Delivery</w:t>
-      </w:r>
-    </w:p>
-    <w:p>
-      <w:pPr>
-        <w:keepNext w:val="0"/>
-        <w:spacing w:after="160" w:before="0" w:line="348" w:lineRule="auto"/>
-        <w:jc w:val="both"/>
-      </w:pPr>
-      <w:r>
-        <w:rPr>
-          <w:rFonts w:ascii="Times New Roman" w:hAnsi="Times New Roman" w:cs="Times New Roman"/>
-          <w:b w:val="0"/>
-          <w:i w:val="0"/>
-          <w:color w:val="111111"/>
-          <w:sz w:val="23"/>
-          <w:szCs w:val="23"/>
-        </w:rPr>
-        <w:t>The interface was implemented responsively for both mobile and desktop viewports, with attention to theme contrast and legibility, reflecting the operational reality that capture occurs on handheld devices in variable store lighting while review and administration occur on desktop.</w:t>
-      </w:r>
-    </w:p>
-    <w:p>
-      <w:pPr>
-        <w:keepNext/>
-        <w:spacing w:before="240" w:after="80"/>
-        <w:jc w:val="center"/>
-      </w:pPr>
-      <w:r>
-        <w:drawing>
-          <wp:inline xmlns:a="http://schemas.openxmlformats.org/drawingml/2006/main" xmlns:pic="http://schemas.openxmlformats.org/drawingml/2006/picture">
-            <wp:extent cx="3891120" cy="5580000"/>
-            <wp:docPr id="5" name="Picture 5"/>
-            <wp:cNvGraphicFramePr>
-              <a:graphicFrameLocks noChangeAspect="1"/>
-            </wp:cNvGraphicFramePr>
-            <a:graphic>
-              <a:graphicData uri="http://schemas.openxmlformats.org/drawingml/2006/picture">
-                <pic:pic>
-                  <pic:nvPicPr>
-                    <pic:cNvPr id="0" name="fig4_app.jpg"/>
-                    <pic:cNvPicPr/>
-                  </pic:nvPicPr>
-                  <pic:blipFill>
-                    <a:blip r:embed="rId13"/>
-                    <a:stretch>
-                      <a:fillRect/>
-                    </a:stretch>
-                  </pic:blipFill>
-                  <pic:spPr>
-                    <a:xfrm>
-                      <a:off x="0" y="0"/>
-                      <a:ext cx="3891120" cy="5580000"/>
-                    </a:xfrm>
-                    <a:prstGeom prst="rect"/>
-                  </pic:spPr>
-                </pic:pic>
-              </a:graphicData>
-            </a:graphic>
-          </wp:inline>
-        </w:drawing>
-      </w:r>
-    </w:p>
-    <w:p>
-      <w:pPr>
-        <w:spacing w:after="280"/>
-        <w:jc w:val="center"/>
-      </w:pPr>
-      <w:r>
-        <w:rPr>
-          <w:rFonts w:ascii="Times New Roman" w:hAnsi="Times New Roman" w:cs="Times New Roman"/>
-          <w:b/>
-          <w:bCs w:val="1"/>
-          <w:i w:val="0"/>
-          <w:color w:val="555555"/>
-          <w:sz w:val="19"/>
-          <w:szCs w:val="19"/>
-        </w:rPr>
-        <w:t xml:space="preserve">Figure 5. </w:t>
-      </w:r>
-      <w:r>
-        <w:rPr>
-          <w:rFonts w:ascii="Times New Roman" w:hAnsi="Times New Roman" w:cs="Times New Roman"/>
-          <w:b w:val="0"/>
-          <w:i/>
-          <w:iCs w:val="1"/>
-          <w:color w:val="555555"/>
-          <w:sz w:val="19"/>
-          <w:szCs w:val="19"/>
-        </w:rPr>
-        <w:t>The application reviewing a live capture: 75 detections returned for a single cooler, with the share-of-shelf summary computed beneath. The crowding of labels is itself informative — it is the dense-packing regime of Section 7, and the reason an operator-facing editor rather than an automatic commit is the appropriate design.</w:t>
-      </w:r>
-    </w:p>
-    <w:p>
-      <w:pPr>
-        <w:keepNext/>
-        <w:spacing w:before="360" w:after="140"/>
-        <w:jc w:val="left"/>
-      </w:pPr>
-      <w:r>
-        <w:rPr>
-          <w:rFonts w:ascii="Times New Roman" w:hAnsi="Times New Roman" w:cs="Times New Roman"/>
-          <w:b/>
-          <w:bCs w:val="1"/>
-          <w:i w:val="0"/>
-          <w:color w:val="1A3A5C"/>
-          <w:sz w:val="28"/>
-          <w:szCs w:val="28"/>
-        </w:rPr>
-        <w:t>11. Results and Outcomes</w:t>
-      </w:r>
-    </w:p>
-    <w:p>
-      <w:pPr>
-        <w:keepNext/>
-        <w:spacing w:before="240" w:after="100"/>
-        <w:jc w:val="center"/>
-      </w:pPr>
-      <w:r>
-        <w:rPr>
-          <w:rFonts w:ascii="Times New Roman" w:hAnsi="Times New Roman" w:cs="Times New Roman"/>
-          <w:b/>
-          <w:bCs w:val="1"/>
-          <w:i w:val="0"/>
-          <w:color w:val="555555"/>
-          <w:sz w:val="19"/>
-          <w:szCs w:val="19"/>
-        </w:rPr>
-        <w:t xml:space="preserve">Table 3. </w:t>
-      </w:r>
-      <w:r>
-        <w:rPr>
-          <w:rFonts w:ascii="Times New Roman" w:hAnsi="Times New Roman" w:cs="Times New Roman"/>
-          <w:b w:val="0"/>
-          <w:i/>
-          <w:iCs w:val="1"/>
-          <w:color w:val="555555"/>
-          <w:sz w:val="19"/>
-          <w:szCs w:val="19"/>
-        </w:rPr>
-        <w:t>Effect of the relabelling and class-collapse on the training corpus.</w:t>
+        <w:t>Detector accuracy, original brand-classed architecture versus the current class-agnostic architecture, both on the RF-DETR-large model.</w:t>
       </w:r>
     </w:p>
     <w:tbl>
@@ -2778,7 +747,7 @@
                 <w:sz w:val="20"/>
                 <w:szCs w:val="20"/>
               </w:rPr>
-              <w:t>Before</w:t>
+              <w:t>Original (brand-classed, 6 classes)</w:t>
             </w:r>
           </w:p>
         </w:tc>
@@ -2802,7 +771,7 @@
                 <w:sz w:val="20"/>
                 <w:szCs w:val="20"/>
               </w:rPr>
-              <w:t>After</w:t>
+              <w:t>Current (class-agnostic)</w:t>
             </w:r>
           </w:p>
         </w:tc>
@@ -2827,7 +796,7 @@
                 <w:sz w:val="20"/>
                 <w:szCs w:val="20"/>
               </w:rPr>
-              <w:t>Shelf images</w:t>
+              <w:t>Training images</w:t>
             </w:r>
           </w:p>
         </w:tc>
@@ -2850,7 +819,7 @@
                 <w:sz w:val="20"/>
                 <w:szCs w:val="20"/>
               </w:rPr>
-              <w:t>213</w:t>
+              <w:t>1,191</w:t>
             </w:r>
           </w:p>
         </w:tc>
@@ -2873,7 +842,7 @@
                 <w:sz w:val="20"/>
                 <w:szCs w:val="20"/>
               </w:rPr>
-              <w:t>213</w:t>
+              <w:t>384</w:t>
             </w:r>
           </w:p>
         </w:tc>
@@ -2898,7 +867,7 @@
                 <w:sz w:val="20"/>
                 <w:szCs w:val="20"/>
               </w:rPr>
-              <w:t>Bounding boxes</w:t>
+              <w:t>mAP50</w:t>
             </w:r>
           </w:p>
         </w:tc>
@@ -2921,7 +890,7 @@
                 <w:sz w:val="20"/>
                 <w:szCs w:val="20"/>
               </w:rPr>
-              <w:t>4,641</w:t>
+              <w:t>86.92%</w:t>
             </w:r>
           </w:p>
         </w:tc>
@@ -2944,7 +913,7 @@
                 <w:sz w:val="20"/>
                 <w:szCs w:val="20"/>
               </w:rPr>
-              <w:t>4,641</w:t>
+              <w:t>89.3%</w:t>
             </w:r>
           </w:p>
         </w:tc>
@@ -2969,7 +938,7 @@
                 <w:sz w:val="20"/>
                 <w:szCs w:val="20"/>
               </w:rPr>
-              <w:t>Classification classes</w:t>
+              <w:t>Precision</w:t>
             </w:r>
           </w:p>
         </w:tc>
@@ -2992,7 +961,7 @@
                 <w:sz w:val="20"/>
                 <w:szCs w:val="20"/>
               </w:rPr>
-              <w:t>6 (brand)</w:t>
+              <w:t>82.7%</w:t>
             </w:r>
           </w:p>
         </w:tc>
@@ -3015,7 +984,7 @@
                 <w:sz w:val="20"/>
                 <w:szCs w:val="20"/>
               </w:rPr>
-              <w:t>4 (format)</w:t>
+              <w:t>90.5%</w:t>
             </w:r>
           </w:p>
         </w:tc>
@@ -3040,7 +1009,7 @@
                 <w:sz w:val="20"/>
                 <w:szCs w:val="20"/>
               </w:rPr>
-              <w:t>Detection classes</w:t>
+              <w:t>Recall</w:t>
             </w:r>
           </w:p>
         </w:tc>
@@ -3063,7 +1032,7 @@
                 <w:sz w:val="20"/>
                 <w:szCs w:val="20"/>
               </w:rPr>
-              <w:t>6</w:t>
+              <w:t>85.8%</w:t>
             </w:r>
           </w:p>
         </w:tc>
@@ -3086,149 +1055,7 @@
                 <w:sz w:val="20"/>
                 <w:szCs w:val="20"/>
               </w:rPr>
-              <w:t>1 (product)</w:t>
-            </w:r>
-          </w:p>
-        </w:tc>
-      </w:tr>
-      <w:tr>
-        <w:tc>
-          <w:tcPr>
-            <w:tcW w:type="dxa" w:w="2986"/>
-          </w:tcPr>
-          <w:p>
-            <w:pPr>
-              <w:spacing w:before="60" w:after="60"/>
-              <w:jc w:val="left"/>
-            </w:pPr>
-            <w:r/>
-            <w:r>
-              <w:rPr>
-                <w:rFonts w:ascii="Times New Roman" w:hAnsi="Times New Roman" w:cs="Times New Roman"/>
-                <w:b w:val="0"/>
-                <w:i w:val="0"/>
-                <w:color w:val="111111"/>
-                <w:sz w:val="20"/>
-                <w:szCs w:val="20"/>
-              </w:rPr>
-              <w:t>Largest : smallest class</w:t>
-            </w:r>
-          </w:p>
-        </w:tc>
-        <w:tc>
-          <w:tcPr>
-            <w:tcW w:type="dxa" w:w="2986"/>
-          </w:tcPr>
-          <w:p>
-            <w:pPr>
-              <w:spacing w:before="60" w:after="60"/>
-              <w:jc w:val="left"/>
-            </w:pPr>
-            <w:r/>
-            <w:r>
-              <w:rPr>
-                <w:rFonts w:ascii="Times New Roman" w:hAnsi="Times New Roman" w:cs="Times New Roman"/>
-                <w:b w:val="0"/>
-                <w:i w:val="0"/>
-                <w:color w:val="111111"/>
-                <w:sz w:val="20"/>
-                <w:szCs w:val="20"/>
-              </w:rPr>
-              <w:t>15 : 1</w:t>
-            </w:r>
-          </w:p>
-        </w:tc>
-        <w:tc>
-          <w:tcPr>
-            <w:tcW w:type="dxa" w:w="2986"/>
-          </w:tcPr>
-          <w:p>
-            <w:pPr>
-              <w:spacing w:before="60" w:after="60"/>
-              <w:jc w:val="left"/>
-            </w:pPr>
-            <w:r/>
-            <w:r>
-              <w:rPr>
-                <w:rFonts w:ascii="Times New Roman" w:hAnsi="Times New Roman" w:cs="Times New Roman"/>
-                <w:b w:val="0"/>
-                <w:i w:val="0"/>
-                <w:color w:val="111111"/>
-                <w:sz w:val="20"/>
-                <w:szCs w:val="20"/>
-              </w:rPr>
-              <w:t>12 : 1</w:t>
-            </w:r>
-          </w:p>
-        </w:tc>
-      </w:tr>
-      <w:tr>
-        <w:tc>
-          <w:tcPr>
-            <w:tcW w:type="dxa" w:w="2986"/>
-          </w:tcPr>
-          <w:p>
-            <w:pPr>
-              <w:spacing w:before="60" w:after="60"/>
-              <w:jc w:val="left"/>
-            </w:pPr>
-            <w:r/>
-            <w:r>
-              <w:rPr>
-                <w:rFonts w:ascii="Times New Roman" w:hAnsi="Times New Roman" w:cs="Times New Roman"/>
-                <w:b w:val="0"/>
-                <w:i w:val="0"/>
-                <w:color w:val="111111"/>
-                <w:sz w:val="20"/>
-                <w:szCs w:val="20"/>
-              </w:rPr>
-              <w:t>Annotations per detection class</w:t>
-            </w:r>
-          </w:p>
-        </w:tc>
-        <w:tc>
-          <w:tcPr>
-            <w:tcW w:type="dxa" w:w="2986"/>
-          </w:tcPr>
-          <w:p>
-            <w:pPr>
-              <w:spacing w:before="60" w:after="60"/>
-              <w:jc w:val="left"/>
-            </w:pPr>
-            <w:r/>
-            <w:r>
-              <w:rPr>
-                <w:rFonts w:ascii="Times New Roman" w:hAnsi="Times New Roman" w:cs="Times New Roman"/>
-                <w:b w:val="0"/>
-                <w:i w:val="0"/>
-                <w:color w:val="111111"/>
-                <w:sz w:val="20"/>
-                <w:szCs w:val="20"/>
-              </w:rPr>
-              <w:t>774 (mean)</w:t>
-            </w:r>
-          </w:p>
-        </w:tc>
-        <w:tc>
-          <w:tcPr>
-            <w:tcW w:type="dxa" w:w="2986"/>
-          </w:tcPr>
-          <w:p>
-            <w:pPr>
-              <w:spacing w:before="60" w:after="60"/>
-              <w:jc w:val="left"/>
-            </w:pPr>
-            <w:r/>
-            <w:r>
-              <w:rPr>
-                <w:rFonts w:ascii="Times New Roman" w:hAnsi="Times New Roman" w:cs="Times New Roman"/>
-                <w:b w:val="0"/>
-                <w:i w:val="0"/>
-                <w:color w:val="111111"/>
-                <w:sz w:val="20"/>
-                <w:szCs w:val="20"/>
-              </w:rPr>
-              <w:t>4,641</w:t>
+              <w:t>81.1%</w:t>
             </w:r>
           </w:p>
         </w:tc>
@@ -3254,7 +1081,26 @@
           <w:sz w:val="23"/>
           <w:szCs w:val="23"/>
         </w:rPr>
-        <w:t>The most consequential quantitative outcome is the sixfold increase in the number of annotations contributing to a single detection class, achieved without collecting additional imagery. Under the original scheme the detector received a mean of 774 examples per class, with the sparsest brand supported by only 131; under the class-agnostic scheme the full corpus of 4,641 boxes supports the single detection objective.</w:t>
+        <w:t>The current architecture reaches higher precision and overall accuracy using roughly a third of the training images the original approach needed — a genuine data-efficiency result, not merely a design argument. Recall is slightly lower, and the honest explanation is a data-migration gap rather than an architectural weakness: the class-agnostic project currently holds only 226 raw images, while the original brand-classed project had grown to 1,191 annotated images by its most mature version. Roughly 800 already-labelled images have not yet been carried over. Migrating them is inexpensive — a programmatic relabel to a single "product" class, not new annotation work — and is the highest-value near-term action identified in this report (Section 7).</w:t>
+      </w:r>
+    </w:p>
+    <w:p>
+      <w:pPr>
+        <w:keepNext/>
+        <w:spacing w:before="240" w:after="140"/>
+        <w:jc w:val="left"/>
+      </w:pPr>
+      <w:r>
+        <w:rPr>
+          <w:rFonts w:ascii="Times New Roman" w:hAnsi="Times New Roman" w:cs="Times New Roman"/>
+          <w:b/>
+          <w:bCs w:val="1"/>
+          <w:i w:val="0"/>
+          <w:color w:val="1A3A5C"/>
+          <w:sz w:val="24"/>
+          <w:szCs w:val="24"/>
+        </w:rPr>
+        <w:t>3.2 Classifier accuracy: a known, closeable gap</w:t>
       </w:r>
     </w:p>
     <w:p>
@@ -3272,7 +1118,7 @@
           <w:sz w:val="23"/>
           <w:szCs w:val="23"/>
         </w:rPr>
-        <w:t>The relabelling assigned formats by ratio band — unknown-package below 1.0, can-std-330 between 1.0 and 2.1, can-slim between 2.1 and 2.9, and bottle-pet above 2.9 — yielding class medians of 0.54, 1.73, 2.57, and 3.26. It should be stated plainly that these bands do not themselves validate the approach: the thresholds define the classes, so their separation is guaranteed by construction. The evidence that box geometry is a usable discriminative signal comes instead from the independent side-by-side measurement reported in Section 6, where the two can formats separated into disjoint measured clusters while the visual classifier assigned them a single class. Inspection of the relabelled images also showed the rule mislabelling partially occluded bottles as cans, which is the error mode Section 7 predicts and a further reason the format assignment requires verification before use.</w:t>
+        <w:t>The brand classifier (Stage 2) and the Fanta flavour classifier (Stage 3) are both trained and serving live traffic, but neither has a formally recorded accuracy evaluation yet — the training platform tracks this separately from the training run itself, and that follow-up step has not been run. This report states that plainly rather than substituting an estimate: no classifier accuracy figure is claimed here that has not been measured. Running the missing evaluation is a same-day task and the first item on the roadmap in Section 7.</w:t>
       </w:r>
     </w:p>
     <w:p>
@@ -3290,7 +1136,99 @@
           <w:sz w:val="23"/>
           <w:szCs w:val="23"/>
         </w:rPr>
-        <w:t>The tangible deliverables of the training period were: a geometrically relabelled annotation set derived programmatically from the original brand-labelled corpus; a documented three-stage system architecture with a verified component-level mapping onto the production platform; and a functioning cross-platform field application supporting structured capture, automated analysis, human verification, and share-of-shelf reporting.</w:t>
+        <w:t>A second classifier, for Coca-Cola flavour variants, was built and seeded with the available labelled photography, then audited by hand before training. That audit found the available Coca-Cola images were almost entirely one variant ("classic") with negligible real diversity — so rather than train a flavour classifier the data cannot actually support, the project was left as a single class pending genuinely varied new photography. This is a data-collection gap, not a modelling one, and is called out explicitly in Section 6.</w:t>
+      </w:r>
+    </w:p>
+    <w:p>
+      <w:pPr>
+        <w:keepNext/>
+        <w:spacing w:before="240" w:after="140"/>
+        <w:jc w:val="left"/>
+      </w:pPr>
+      <w:r>
+        <w:rPr>
+          <w:rFonts w:ascii="Times New Roman" w:hAnsi="Times New Roman" w:cs="Times New Roman"/>
+          <w:b/>
+          <w:bCs w:val="1"/>
+          <w:i w:val="0"/>
+          <w:color w:val="1A3A5C"/>
+          <w:sz w:val="24"/>
+          <w:szCs w:val="24"/>
+        </w:rPr>
+        <w:t>3.3 Packaging-material classifier: an experiment in progress</w:t>
+      </w:r>
+    </w:p>
+    <w:p>
+      <w:pPr>
+        <w:keepNext w:val="0"/>
+        <w:spacing w:after="160" w:before="0" w:line="348" w:lineRule="auto"/>
+        <w:jc w:val="both"/>
+      </w:pPr>
+      <w:r>
+        <w:rPr>
+          <w:rFonts w:ascii="Times New Roman" w:hAnsi="Times New Roman" w:cs="Times New Roman"/>
+          <w:b w:val="0"/>
+          <w:i w:val="0"/>
+          <w:color w:val="111111"/>
+          <w:sz w:val="23"/>
+          <w:szCs w:val="23"/>
+        </w:rPr>
+        <w:t>A new, independent signal — packaging material (glass, plastic, or can) — is being evaluated separately from brand and flavour, on the basis that material is brand-independent: a plastic bottle looks plastic regardless of manufacturer, so one shared classifier serves every brand and every future brand added to the catalogue, rather than needing a per-brand model.</w:t>
+      </w:r>
+    </w:p>
+    <w:p>
+      <w:pPr>
+        <w:keepNext w:val="0"/>
+        <w:spacing w:after="160" w:before="0" w:line="348" w:lineRule="auto"/>
+        <w:jc w:val="both"/>
+      </w:pPr>
+      <w:r>
+        <w:rPr>
+          <w:rFonts w:ascii="Times New Roman" w:hAnsi="Times New Roman" w:cs="Times New Roman"/>
+          <w:b w:val="0"/>
+          <w:i w:val="0"/>
+          <w:color w:val="111111"/>
+          <w:sz w:val="23"/>
+          <w:szCs w:val="23"/>
+        </w:rPr>
+        <w:t>A full visual audit of the 1,608 images available across all six brands found only two genuine glass-packaging examples in the entire corpus — far too few to train a reliable glass class. Rather than force those two images into a mislabelled bucket or overstate a third category, the experiment was scoped down to a two-class problem, plastic versus can, with a workable, roughly balanced split of 860 plastic and 746 can images. Image upload for this experiment is complete; labelling and training are in progress at the time of writing. This is reported as an open, honest in-progress item, not a finished result.</w:t>
+      </w:r>
+    </w:p>
+    <w:p>
+      <w:pPr>
+        <w:keepNext/>
+        <w:spacing w:before="240" w:after="140"/>
+        <w:jc w:val="left"/>
+      </w:pPr>
+      <w:r>
+        <w:rPr>
+          <w:rFonts w:ascii="Times New Roman" w:hAnsi="Times New Roman" w:cs="Times New Roman"/>
+          <w:b/>
+          <w:bCs w:val="1"/>
+          <w:i w:val="0"/>
+          <w:color w:val="1A3A5C"/>
+          <w:sz w:val="24"/>
+          <w:szCs w:val="24"/>
+        </w:rPr>
+        <w:t>3.4 Engineering maturity: caught, fixed, and verified against live data</w:t>
+      </w:r>
+    </w:p>
+    <w:p>
+      <w:pPr>
+        <w:keepNext w:val="0"/>
+        <w:spacing w:after="160" w:before="0" w:line="348" w:lineRule="auto"/>
+        <w:jc w:val="both"/>
+      </w:pPr>
+      <w:r>
+        <w:rPr>
+          <w:rFonts w:ascii="Times New Roman" w:hAnsi="Times New Roman" w:cs="Times New Roman"/>
+          <w:b w:val="0"/>
+          <w:i w:val="0"/>
+          <w:color w:val="111111"/>
+          <w:sz w:val="23"/>
+          <w:szCs w:val="23"/>
+        </w:rPr>
+        <w:t>Two incidents from this engagement are included deliberately, as evidence of process rather than as embarrassments to omit. First, a defect in the workflow's custom merge logic was silently turning full class names into single stray characters in the live application; it was diagnosed from a user report, root-caused to a data-shape assumption that training-time metrics could not have caught, fixed, and verified against a real photograph within the same working session. Second, a geometric rule for distinguishing packaging formats by box shape — a promising result on the specific example it was measured against — did not generalise reliably enough in broader use and has been suspended in production while a more accurate approach is developed; the code and its tests are kept intact, not deleted, for that follow-up. Both are the kind of finding a system only surfaces once it is actually run against real, uncontrolled data — which is itself part of the evidence that this project has moved past the design stage.</w:t>
       </w:r>
     </w:p>
     <w:p>
@@ -3309,7 +1247,7 @@
           <w:sz w:val="28"/>
           <w:szCs w:val="28"/>
         </w:rPr>
-        <w:t>12. Challenges Encountered</w:t>
+        <w:t>4. Economics: The Cost to Scale</w:t>
       </w:r>
     </w:p>
     <w:p>
@@ -3327,7 +1265,432 @@
           <w:sz w:val="23"/>
           <w:szCs w:val="23"/>
         </w:rPr>
-        <w:t>The principal difficulties of the period were not algorithmic but evidential — establishing what the data and the tooling were actually doing, as opposed to what they were assumed to be doing.</w:t>
+        <w:t>The central commercial risk in any catalogue-driven product is that growth becomes expensive: every new SKU, every new market, every new customer could in principle demand new engineering. This architecture was specifically chosen to avoid that, and the claim is backed by this engagement's own measured costs rather than a projection.</w:t>
+      </w:r>
+    </w:p>
+    <w:p>
+      <w:pPr>
+        <w:keepNext/>
+        <w:spacing w:before="240" w:after="100"/>
+        <w:jc w:val="center"/>
+      </w:pPr>
+      <w:r>
+        <w:rPr>
+          <w:rFonts w:ascii="Times New Roman" w:hAnsi="Times New Roman" w:cs="Times New Roman"/>
+          <w:b/>
+          <w:bCs w:val="1"/>
+          <w:i w:val="0"/>
+          <w:color w:val="555555"/>
+          <w:sz w:val="19"/>
+          <w:szCs w:val="19"/>
+        </w:rPr>
+        <w:t xml:space="preserve">Table 2. </w:t>
+      </w:r>
+      <w:r>
+        <w:rPr>
+          <w:rFonts w:ascii="Times New Roman" w:hAnsi="Times New Roman" w:cs="Times New Roman"/>
+          <w:b w:val="0"/>
+          <w:i/>
+          <w:iCs w:val="1"/>
+          <w:color w:val="555555"/>
+          <w:sz w:val="19"/>
+          <w:szCs w:val="19"/>
+        </w:rPr>
+        <w:t>Actual training cost of every model in the current production stack, at Roboflow's published rate of one credit per thirty minutes of GPU training.</w:t>
+      </w:r>
+    </w:p>
+    <w:tbl>
+      <w:tblPr>
+        <w:tblStyle w:val="TableGrid"/>
+        <w:tblW w:type="auto" w:w="0"/>
+        <w:jc w:val="left"/>
+        <w:tblLook w:firstColumn="1" w:firstRow="1" w:lastColumn="0" w:lastRow="0" w:noHBand="0" w:noVBand="1" w:val="04A0"/>
+      </w:tblPr>
+      <w:tblGrid>
+        <w:gridCol w:w="2986"/>
+        <w:gridCol w:w="2986"/>
+        <w:gridCol w:w="2986"/>
+      </w:tblGrid>
+      <w:tr>
+        <w:tc>
+          <w:tcPr>
+            <w:tcW w:type="dxa" w:w="2986"/>
+          </w:tcPr>
+          <w:p>
+            <w:pPr>
+              <w:spacing w:before="60" w:after="60"/>
+              <w:jc w:val="left"/>
+            </w:pPr>
+            <w:r/>
+            <w:r>
+              <w:rPr>
+                <w:rFonts w:ascii="Times New Roman" w:hAnsi="Times New Roman" w:cs="Times New Roman"/>
+                <w:b/>
+                <w:bCs w:val="1"/>
+                <w:i w:val="0"/>
+                <w:color w:val="111111"/>
+                <w:sz w:val="20"/>
+                <w:szCs w:val="20"/>
+              </w:rPr>
+              <w:t>Model</w:t>
+            </w:r>
+          </w:p>
+        </w:tc>
+        <w:tc>
+          <w:tcPr>
+            <w:tcW w:type="dxa" w:w="2986"/>
+          </w:tcPr>
+          <w:p>
+            <w:pPr>
+              <w:spacing w:before="60" w:after="60"/>
+              <w:jc w:val="left"/>
+            </w:pPr>
+            <w:r/>
+            <w:r>
+              <w:rPr>
+                <w:rFonts w:ascii="Times New Roman" w:hAnsi="Times New Roman" w:cs="Times New Roman"/>
+                <w:b/>
+                <w:bCs w:val="1"/>
+                <w:i w:val="0"/>
+                <w:color w:val="111111"/>
+                <w:sz w:val="20"/>
+                <w:szCs w:val="20"/>
+              </w:rPr>
+              <w:t>Training time</w:t>
+            </w:r>
+          </w:p>
+        </w:tc>
+        <w:tc>
+          <w:tcPr>
+            <w:tcW w:type="dxa" w:w="2986"/>
+          </w:tcPr>
+          <w:p>
+            <w:pPr>
+              <w:spacing w:before="60" w:after="60"/>
+              <w:jc w:val="left"/>
+            </w:pPr>
+            <w:r/>
+            <w:r>
+              <w:rPr>
+                <w:rFonts w:ascii="Times New Roman" w:hAnsi="Times New Roman" w:cs="Times New Roman"/>
+                <w:b/>
+                <w:bCs w:val="1"/>
+                <w:i w:val="0"/>
+                <w:color w:val="111111"/>
+                <w:sz w:val="20"/>
+                <w:szCs w:val="20"/>
+              </w:rPr>
+              <w:t>Training credits</w:t>
+            </w:r>
+          </w:p>
+        </w:tc>
+      </w:tr>
+      <w:tr>
+        <w:tc>
+          <w:tcPr>
+            <w:tcW w:type="dxa" w:w="2986"/>
+          </w:tcPr>
+          <w:p>
+            <w:pPr>
+              <w:spacing w:before="60" w:after="60"/>
+              <w:jc w:val="left"/>
+            </w:pPr>
+            <w:r/>
+            <w:r>
+              <w:rPr>
+                <w:rFonts w:ascii="Times New Roman" w:hAnsi="Times New Roman" w:cs="Times New Roman"/>
+                <w:b w:val="0"/>
+                <w:i w:val="0"/>
+                <w:color w:val="111111"/>
+                <w:sz w:val="20"/>
+                <w:szCs w:val="20"/>
+              </w:rPr>
+              <w:t>Original detector (first version)</w:t>
+            </w:r>
+          </w:p>
+        </w:tc>
+        <w:tc>
+          <w:tcPr>
+            <w:tcW w:type="dxa" w:w="2986"/>
+          </w:tcPr>
+          <w:p>
+            <w:pPr>
+              <w:spacing w:before="60" w:after="60"/>
+              <w:jc w:val="left"/>
+            </w:pPr>
+            <w:r/>
+            <w:r>
+              <w:rPr>
+                <w:rFonts w:ascii="Times New Roman" w:hAnsi="Times New Roman" w:cs="Times New Roman"/>
+                <w:b w:val="0"/>
+                <w:i w:val="0"/>
+                <w:color w:val="111111"/>
+                <w:sz w:val="20"/>
+                <w:szCs w:val="20"/>
+              </w:rPr>
+              <w:t>11.2 min</w:t>
+            </w:r>
+          </w:p>
+        </w:tc>
+        <w:tc>
+          <w:tcPr>
+            <w:tcW w:type="dxa" w:w="2986"/>
+          </w:tcPr>
+          <w:p>
+            <w:pPr>
+              <w:spacing w:before="60" w:after="60"/>
+              <w:jc w:val="left"/>
+            </w:pPr>
+            <w:r/>
+            <w:r>
+              <w:rPr>
+                <w:rFonts w:ascii="Times New Roman" w:hAnsi="Times New Roman" w:cs="Times New Roman"/>
+                <w:b w:val="0"/>
+                <w:i w:val="0"/>
+                <w:color w:val="111111"/>
+                <w:sz w:val="20"/>
+                <w:szCs w:val="20"/>
+              </w:rPr>
+              <w:t>0.37</w:t>
+            </w:r>
+          </w:p>
+        </w:tc>
+      </w:tr>
+      <w:tr>
+        <w:tc>
+          <w:tcPr>
+            <w:tcW w:type="dxa" w:w="2986"/>
+          </w:tcPr>
+          <w:p>
+            <w:pPr>
+              <w:spacing w:before="60" w:after="60"/>
+              <w:jc w:val="left"/>
+            </w:pPr>
+            <w:r/>
+            <w:r>
+              <w:rPr>
+                <w:rFonts w:ascii="Times New Roman" w:hAnsi="Times New Roman" w:cs="Times New Roman"/>
+                <w:b w:val="0"/>
+                <w:i w:val="0"/>
+                <w:color w:val="111111"/>
+                <w:sz w:val="20"/>
+                <w:szCs w:val="20"/>
+              </w:rPr>
+              <w:t>Current production detector</w:t>
+            </w:r>
+          </w:p>
+        </w:tc>
+        <w:tc>
+          <w:tcPr>
+            <w:tcW w:type="dxa" w:w="2986"/>
+          </w:tcPr>
+          <w:p>
+            <w:pPr>
+              <w:spacing w:before="60" w:after="60"/>
+              <w:jc w:val="left"/>
+            </w:pPr>
+            <w:r/>
+            <w:r>
+              <w:rPr>
+                <w:rFonts w:ascii="Times New Roman" w:hAnsi="Times New Roman" w:cs="Times New Roman"/>
+                <w:b w:val="0"/>
+                <w:i w:val="0"/>
+                <w:color w:val="111111"/>
+                <w:sz w:val="20"/>
+                <w:szCs w:val="20"/>
+              </w:rPr>
+              <w:t>44.2 min</w:t>
+            </w:r>
+          </w:p>
+        </w:tc>
+        <w:tc>
+          <w:tcPr>
+            <w:tcW w:type="dxa" w:w="2986"/>
+          </w:tcPr>
+          <w:p>
+            <w:pPr>
+              <w:spacing w:before="60" w:after="60"/>
+              <w:jc w:val="left"/>
+            </w:pPr>
+            <w:r/>
+            <w:r>
+              <w:rPr>
+                <w:rFonts w:ascii="Times New Roman" w:hAnsi="Times New Roman" w:cs="Times New Roman"/>
+                <w:b w:val="0"/>
+                <w:i w:val="0"/>
+                <w:color w:val="111111"/>
+                <w:sz w:val="20"/>
+                <w:szCs w:val="20"/>
+              </w:rPr>
+              <w:t>1.48</w:t>
+            </w:r>
+          </w:p>
+        </w:tc>
+      </w:tr>
+      <w:tr>
+        <w:tc>
+          <w:tcPr>
+            <w:tcW w:type="dxa" w:w="2986"/>
+          </w:tcPr>
+          <w:p>
+            <w:pPr>
+              <w:spacing w:before="60" w:after="60"/>
+              <w:jc w:val="left"/>
+            </w:pPr>
+            <w:r/>
+            <w:r>
+              <w:rPr>
+                <w:rFonts w:ascii="Times New Roman" w:hAnsi="Times New Roman" w:cs="Times New Roman"/>
+                <w:b w:val="0"/>
+                <w:i w:val="0"/>
+                <w:color w:val="111111"/>
+                <w:sz w:val="20"/>
+                <w:szCs w:val="20"/>
+              </w:rPr>
+              <w:t>Brand classifier (Stage 2)</w:t>
+            </w:r>
+          </w:p>
+        </w:tc>
+        <w:tc>
+          <w:tcPr>
+            <w:tcW w:type="dxa" w:w="2986"/>
+          </w:tcPr>
+          <w:p>
+            <w:pPr>
+              <w:spacing w:before="60" w:after="60"/>
+              <w:jc w:val="left"/>
+            </w:pPr>
+            <w:r/>
+            <w:r>
+              <w:rPr>
+                <w:rFonts w:ascii="Times New Roman" w:hAnsi="Times New Roman" w:cs="Times New Roman"/>
+                <w:b w:val="0"/>
+                <w:i w:val="0"/>
+                <w:color w:val="111111"/>
+                <w:sz w:val="20"/>
+                <w:szCs w:val="20"/>
+              </w:rPr>
+              <w:t>9.1 min</w:t>
+            </w:r>
+          </w:p>
+        </w:tc>
+        <w:tc>
+          <w:tcPr>
+            <w:tcW w:type="dxa" w:w="2986"/>
+          </w:tcPr>
+          <w:p>
+            <w:pPr>
+              <w:spacing w:before="60" w:after="60"/>
+              <w:jc w:val="left"/>
+            </w:pPr>
+            <w:r/>
+            <w:r>
+              <w:rPr>
+                <w:rFonts w:ascii="Times New Roman" w:hAnsi="Times New Roman" w:cs="Times New Roman"/>
+                <w:b w:val="0"/>
+                <w:i w:val="0"/>
+                <w:color w:val="111111"/>
+                <w:sz w:val="20"/>
+                <w:szCs w:val="20"/>
+              </w:rPr>
+              <w:t>0.30</w:t>
+            </w:r>
+          </w:p>
+        </w:tc>
+      </w:tr>
+      <w:tr>
+        <w:tc>
+          <w:tcPr>
+            <w:tcW w:type="dxa" w:w="2986"/>
+          </w:tcPr>
+          <w:p>
+            <w:pPr>
+              <w:spacing w:before="60" w:after="60"/>
+              <w:jc w:val="left"/>
+            </w:pPr>
+            <w:r/>
+            <w:r>
+              <w:rPr>
+                <w:rFonts w:ascii="Times New Roman" w:hAnsi="Times New Roman" w:cs="Times New Roman"/>
+                <w:b w:val="0"/>
+                <w:i w:val="0"/>
+                <w:color w:val="111111"/>
+                <w:sz w:val="20"/>
+                <w:szCs w:val="20"/>
+              </w:rPr>
+              <w:t>Fanta flavour classifier (Stage 3)</w:t>
+            </w:r>
+          </w:p>
+        </w:tc>
+        <w:tc>
+          <w:tcPr>
+            <w:tcW w:type="dxa" w:w="2986"/>
+          </w:tcPr>
+          <w:p>
+            <w:pPr>
+              <w:spacing w:before="60" w:after="60"/>
+              <w:jc w:val="left"/>
+            </w:pPr>
+            <w:r/>
+            <w:r>
+              <w:rPr>
+                <w:rFonts w:ascii="Times New Roman" w:hAnsi="Times New Roman" w:cs="Times New Roman"/>
+                <w:b w:val="0"/>
+                <w:i w:val="0"/>
+                <w:color w:val="111111"/>
+                <w:sz w:val="20"/>
+                <w:szCs w:val="20"/>
+              </w:rPr>
+              <w:t>7.2 min</w:t>
+            </w:r>
+          </w:p>
+        </w:tc>
+        <w:tc>
+          <w:tcPr>
+            <w:tcW w:type="dxa" w:w="2986"/>
+          </w:tcPr>
+          <w:p>
+            <w:pPr>
+              <w:spacing w:before="60" w:after="60"/>
+              <w:jc w:val="left"/>
+            </w:pPr>
+            <w:r/>
+            <w:r>
+              <w:rPr>
+                <w:rFonts w:ascii="Times New Roman" w:hAnsi="Times New Roman" w:cs="Times New Roman"/>
+                <w:b w:val="0"/>
+                <w:i w:val="0"/>
+                <w:color w:val="111111"/>
+                <w:sz w:val="20"/>
+                <w:szCs w:val="20"/>
+              </w:rPr>
+              <w:t>0.24</w:t>
+            </w:r>
+          </w:p>
+        </w:tc>
+      </w:tr>
+    </w:tbl>
+    <w:p>
+      <w:pPr>
+        <w:spacing w:after="200" w:before="0"/>
+      </w:pPr>
+    </w:p>
+    <w:p>
+      <w:pPr>
+        <w:keepNext w:val="0"/>
+        <w:spacing w:after="160" w:before="0" w:line="348" w:lineRule="auto"/>
+        <w:jc w:val="both"/>
+      </w:pPr>
+      <w:r>
+        <w:rPr>
+          <w:rFonts w:ascii="Times New Roman" w:hAnsi="Times New Roman" w:cs="Times New Roman"/>
+          <w:b w:val="0"/>
+          <w:i w:val="0"/>
+          <w:color w:val="111111"/>
+          <w:sz w:val="23"/>
+          <w:szCs w:val="23"/>
+        </w:rPr>
+        <w:t>The entire current three-model production stack has cost roughly 2 credits (about one hour of GPU time) to train, in total, ever — a small fraction of a single month's allowance on even the cheapest paid plan. Moving from one model to three did not meaningfully raise training cost while measurably raising accuracy (Section 3.1). Current dollar pricing changes independently of this report and should always be checked directly against Roboflow's published rates rather than quoted here as a fixed figure.</w:t>
       </w:r>
     </w:p>
     <w:p>
@@ -3345,7 +1708,7 @@
           <w:sz w:val="23"/>
           <w:szCs w:val="23"/>
         </w:rPr>
-        <w:t>The first was annotation ambiguity at scale. Over two-fifths of the corpus required an ambiguity flag, and each flagged box demanded a judgement that no threshold could make automatically. Relabelling 4,641 boxes by physical format also revealed that a purely geometric rule inherits every defect of the box it reads: a partially occluded bottle produces a short box and is misread as a can. Distinguishing genuine format differences from artefacts of capture consumed a substantial share of the period, and the resulting label set still contains errors of this kind.</w:t>
+        <w:t>The more consequential number for an investor is the marginal cost of catalogue growth, and this engagement produced a direct, not hypothetical, data point: adding Fanta flavour differentiation — a new axis of product identity — required labelling a few hundred already-available product images and training one small classifier, wired into the pipeline as a parallel step. No change to the detector or the brand classifier was needed. It was completed within hours, not weeks. The same pattern applies to onboarding an entirely new company: the backing database is multi-tenant by design, so a new customer is a data-entry operation, not a code change.</w:t>
       </w:r>
     </w:p>
     <w:p>
@@ -3363,25 +1726,7 @@
           <w:sz w:val="23"/>
           <w:szCs w:val="23"/>
         </w:rPr>
-        <w:t>The second was diagnosing behaviour that configuration, not modelling, was causing. Poor coverage of the newer brands initially appeared to be a detection failure. It was in fact governed by a default model version trained on 27 images, long superseded but still invoked by the workflow. Similarly, the failure to separate can formats looked like insufficient training data until the mechanism was identified — the embedding model resizes crops to a fixed square and discards aspect ratio before inference. In both cases the visible symptom pointed away from the actual cause.</w:t>
-      </w:r>
-    </w:p>
-    <w:p>
-      <w:pPr>
-        <w:keepNext w:val="0"/>
-        <w:spacing w:after="160" w:before="0" w:line="348" w:lineRule="auto"/>
-        <w:jc w:val="both"/>
-      </w:pPr>
-      <w:r>
-        <w:rPr>
-          <w:rFonts w:ascii="Times New Roman" w:hAnsi="Times New Roman" w:cs="Times New Roman"/>
-          <w:b w:val="0"/>
-          <w:i w:val="0"/>
-          <w:color w:val="111111"/>
-          <w:sz w:val="23"/>
-          <w:szCs w:val="23"/>
-        </w:rPr>
-        <w:t>A third, more practical difficulty was tooling friction during the dataset migration. Bulk annotation upload through the platform API proved to have no per-image overwrite path, so a single malformed request left one image with an empty annotation that could not be corrected programmatically. Working within the constraints of a hosted platform — rather than assuming full control over the data store — was itself part of the learning.</w:t>
+        <w:t>One cost is real and not yet measured, and is stated here rather than left out: the current pipeline issues a brand-classification and a flavour-classification call for every detected product in a photograph, not once per photograph, so a busy shelf with twenty products now triggers meaningfully more classification calls than the original single-model approach. This should be measured directly from live workflow usage before it is quoted as a number, and is flagged as an open item in Section 6.</w:t>
       </w:r>
     </w:p>
     <w:p>
@@ -3400,7 +1745,7 @@
           <w:sz w:val="28"/>
           <w:szCs w:val="28"/>
         </w:rPr>
-        <w:t>13. Next Steps and Support Required</w:t>
+        <w:t>5. The Application: Field-Proven</w:t>
       </w:r>
     </w:p>
     <w:p>
@@ -3418,7 +1763,7 @@
           <w:sz w:val="23"/>
           <w:szCs w:val="23"/>
         </w:rPr>
-        <w:t>The immediate technical priority is to train the class-agnostic detector on the collapsed label set and measure it properly. To date the expected improvement rests on a statistical argument — a sixfold increase in annotations per detection class — and not on a measured result. A held-out evaluation reporting per-class recall and mean average precision, compared against the current brand-classed detector, is required before the architecture can be claimed to work rather than merely to be well-motivated.</w:t>
+        <w:t>A cross-platform application, developed alongside the model architecture, is what turns model output into a usable business process rather than a research demo. It standardises field capture, runs the detection pipeline against each photograph, and — critically — interposes a human reviewer between raw model output and any figure that gets reported as fact.</w:t>
       </w:r>
     </w:p>
     <w:p>
@@ -3436,25 +1781,78 @@
           <w:sz w:val="23"/>
           <w:szCs w:val="23"/>
         </w:rPr>
-        <w:t>Beyond that, three pieces of work follow in order: completing the annotations for products never labelled at all, which no reorganisation of the label space can substitute for; assembling the reference gallery that Stage Two depends on; and implementing the Stage Three fusion inside the platform workflow so the rule verified client-side runs server-side as well.</w:t>
+        <w:t>Since the start of this engagement the application has grown past initial capture-and-review into reporting the business actually asked for: a Submissions view so a company administrator can see what a field representative actually recorded (previously, captured data was written to the database but nothing in the application read it back), and a brand-to-variant Share-of-Shelf report giving each brand's overall percentage of shelf space broken down into the specific variants the pipeline currently distinguishes. A low-quality capture warning — a photograph shot too far from the shelf to count reliably — was also upgraded from an easy-to-miss notification to a dialog the representative must actively dismiss, directly reducing a source of silent undercounting in the field.</w:t>
       </w:r>
     </w:p>
     <w:p>
       <w:pPr>
-        <w:keepNext w:val="0"/>
-        <w:spacing w:after="160" w:before="0" w:line="348" w:lineRule="auto"/>
-        <w:jc w:val="both"/>
+        <w:keepNext/>
+        <w:spacing w:before="240" w:after="80"/>
+        <w:jc w:val="center"/>
+      </w:pPr>
+      <w:r>
+        <w:drawing>
+          <wp:inline xmlns:a="http://schemas.openxmlformats.org/drawingml/2006/main" xmlns:pic="http://schemas.openxmlformats.org/drawingml/2006/picture">
+            <wp:extent cx="3891120" cy="5580000"/>
+            <wp:docPr id="3" name="Picture 3"/>
+            <wp:cNvGraphicFramePr>
+              <a:graphicFrameLocks noChangeAspect="1"/>
+            </wp:cNvGraphicFramePr>
+            <a:graphic>
+              <a:graphicData uri="http://schemas.openxmlformats.org/drawingml/2006/picture">
+                <pic:pic>
+                  <pic:nvPicPr>
+                    <pic:cNvPr id="0" name="fig4_app.jpg"/>
+                    <pic:cNvPicPr/>
+                  </pic:nvPicPr>
+                  <pic:blipFill>
+                    <a:blip r:embed="rId11"/>
+                    <a:stretch>
+                      <a:fillRect/>
+                    </a:stretch>
+                  </pic:blipFill>
+                  <pic:spPr>
+                    <a:xfrm>
+                      <a:off x="0" y="0"/>
+                      <a:ext cx="3891120" cy="5580000"/>
+                    </a:xfrm>
+                    <a:prstGeom prst="rect"/>
+                  </pic:spPr>
+                </pic:pic>
+              </a:graphicData>
+            </a:graphic>
+          </wp:inline>
+        </w:drawing>
+      </w:r>
+    </w:p>
+    <w:p>
+      <w:pPr>
+        <w:spacing w:after="280"/>
+        <w:jc w:val="center"/>
       </w:pPr>
       <w:r>
         <w:rPr>
           <w:rFonts w:ascii="Times New Roman" w:hAnsi="Times New Roman" w:cs="Times New Roman"/>
+          <w:b/>
+          <w:bCs w:val="1"/>
+          <w:i w:val="0"/>
+          <w:color w:val="555555"/>
+          <w:sz w:val="19"/>
+          <w:szCs w:val="19"/>
+        </w:rPr>
+        <w:t xml:space="preserve">Figure 3. </w:t>
+      </w:r>
+      <w:r>
+        <w:rPr>
+          <w:rFonts w:ascii="Times New Roman" w:hAnsi="Times New Roman" w:cs="Times New Roman"/>
           <w:b w:val="0"/>
-          <w:i w:val="0"/>
-          <w:color w:val="111111"/>
-          <w:sz w:val="23"/>
-          <w:szCs w:val="23"/>
+          <w:i/>
+          <w:iCs w:val="1"/>
+          <w:color w:val="555555"/>
+          <w:sz w:val="19"/>
+          <w:szCs w:val="19"/>
         </w:rPr>
-        <w:t>Progress on these depends on inputs the training period could not supply from within. Most consequential is a product reference set — clean single-product images for each SKU in scope, together with a catalogue giving physical dimensions, since the geometric thresholds are currently calibrated on two can formats and would need extending per format encountered. Also needed is guidance on the accuracy that constitutes production readiness, as the correct operating point for a shelf audit — and therefore how readily the system should defer to human verification — is a commercial judgement rather than a technical one. Finally, additional field imagery spanning store types, shelf configurations, and lighting conditions would materially improve generalisation; the current corpus, at 213 images, is small relative to the variability the deployed system will meet.</w:t>
+        <w:t>The application reviewing a live capture, with detections and a share-of-shelf summary computed beneath — the point at which an automated count becomes a number a person has actually verified before it is reported.</w:t>
       </w:r>
     </w:p>
     <w:p>
@@ -3473,7 +1871,7 @@
           <w:sz w:val="28"/>
           <w:szCs w:val="28"/>
         </w:rPr>
-        <w:t>14. Reflection on Learning Outcomes</w:t>
+        <w:t>6. Risks and Open Gaps</w:t>
       </w:r>
     </w:p>
     <w:p>
@@ -3491,13 +1889,13 @@
           <w:sz w:val="23"/>
           <w:szCs w:val="23"/>
         </w:rPr>
-        <w:t>The most consequential lesson of the training was that the decisive question in an applied vision system is frequently not which model performs best, but how responsibility should be divided between components. Considerable time was initially directed toward improving classification accuracy within a single-stage design before it became apparent that the accuracy ceiling was imposed by the architecture rather than by the model.</w:t>
+        <w:t>Stated in the order they should be closed, with the honest reason each remains open:</w:t>
       </w:r>
     </w:p>
     <w:p>
       <w:pPr>
         <w:keepNext w:val="0"/>
-        <w:spacing w:after="160" w:before="0" w:line="348" w:lineRule="auto"/>
+        <w:spacing w:after="120" w:before="0" w:line="348" w:lineRule="auto"/>
         <w:jc w:val="both"/>
       </w:pPr>
       <w:r>
@@ -3509,13 +1907,13 @@
           <w:sz w:val="23"/>
           <w:szCs w:val="23"/>
         </w:rPr>
-        <w:t>A second lesson concerned the value of identifying a model's representational boundary rather than attempting to overcome it by training. Establishing not merely that CLIP failed to distinguish the two can formats, but why — that the square resize discards aspect ratio before encoding — converted an apparently stubborn accuracy problem into a solved one, and did so with a rule of a few lines rather than additional data collection.</w:t>
+        <w:t>1. Classifier accuracy is unmeasured. The brand and Fanta-flavour classifiers are live but have no recorded evaluation. Closing this is a same-day task with no dependency on new data.</w:t>
       </w:r>
     </w:p>
     <w:p>
       <w:pPr>
         <w:keepNext w:val="0"/>
-        <w:spacing w:after="160" w:before="0" w:line="348" w:lineRule="auto"/>
+        <w:spacing w:after="120" w:before="0" w:line="348" w:lineRule="auto"/>
         <w:jc w:val="both"/>
       </w:pPr>
       <w:r>
@@ -3527,7 +1925,61 @@
           <w:sz w:val="23"/>
           <w:szCs w:val="23"/>
         </w:rPr>
-        <w:t>A third lesson emerged from the annotation work: the effort required to produce reliable annotations at scale is routinely underestimated, and design decisions that reduce annotation burden — such as collapsing many classes into one — can improve system outcomes more than algorithmic refinements. Relatedly, discovering that a stale default model version was governing live behaviour was a reminder that in deployed systems, configuration is as consequential as modelling, and considerably easier to overlook.</w:t>
+        <w:t>2. The detector's recall gap traces to a specific, known cause. Roughly 800 already-annotated images from the original project have not been migrated into the class-agnostic one. This is a data-engineering task, not new research.</w:t>
+      </w:r>
+    </w:p>
+    <w:p>
+      <w:pPr>
+        <w:keepNext w:val="0"/>
+        <w:spacing w:after="120" w:before="0" w:line="348" w:lineRule="auto"/>
+        <w:jc w:val="both"/>
+      </w:pPr>
+      <w:r>
+        <w:rPr>
+          <w:rFonts w:ascii="Times New Roman" w:hAnsi="Times New Roman" w:cs="Times New Roman"/>
+          <w:b w:val="0"/>
+          <w:i w:val="0"/>
+          <w:color w:val="111111"/>
+          <w:sz w:val="23"/>
+          <w:szCs w:val="23"/>
+        </w:rPr>
+        <w:t>3. The packaging-material classifier is untrained and, more fundamentally, has almost no glass examples to learn from — two images across the entire labelled corpus. Plastic-versus-can is workable with existing data; a genuine glass class requires targeted new photography, not more labelling of what already exists.</w:t>
+      </w:r>
+    </w:p>
+    <w:p>
+      <w:pPr>
+        <w:keepNext w:val="0"/>
+        <w:spacing w:after="120" w:before="0" w:line="348" w:lineRule="auto"/>
+        <w:jc w:val="both"/>
+      </w:pPr>
+      <w:r>
+        <w:rPr>
+          <w:rFonts w:ascii="Times New Roman" w:hAnsi="Times New Roman" w:cs="Times New Roman"/>
+          <w:b w:val="0"/>
+          <w:i w:val="0"/>
+          <w:color w:val="111111"/>
+          <w:sz w:val="23"/>
+          <w:szCs w:val="23"/>
+        </w:rPr>
+        <w:t>4. Coca-Cola flavour variety does not exist in the current data. The available photographs are almost entirely one variant. This is the same fix as item 3 — new photography of the missing variants — and should not be attempted by relabelling existing images, which the audit already ruled out.</w:t>
+      </w:r>
+    </w:p>
+    <w:p>
+      <w:pPr>
+        <w:keepNext w:val="0"/>
+        <w:spacing w:after="120" w:before="0" w:line="348" w:lineRule="auto"/>
+        <w:jc w:val="both"/>
+      </w:pPr>
+      <w:r>
+        <w:rPr>
+          <w:rFonts w:ascii="Times New Roman" w:hAnsi="Times New Roman" w:cs="Times New Roman"/>
+          <w:b w:val="0"/>
+          <w:i w:val="0"/>
+          <w:color w:val="111111"/>
+          <w:sz w:val="23"/>
+          <w:szCs w:val="23"/>
+        </w:rPr>
+        <w:t>5. Per-product inference cost at scale has not been measured. The architecture change moved from one classification call per photograph to several per detected product; the real cost impact should be measured from live usage before it is used in a cost projection.</w:t>
       </w:r>
     </w:p>
     <w:p>
@@ -3546,7 +1998,7 @@
           <w:sz w:val="28"/>
           <w:szCs w:val="28"/>
         </w:rPr>
-        <w:t>15. Conclusions</w:t>
+        <w:t>7. Recommendation and Next Steps</w:t>
       </w:r>
     </w:p>
     <w:p>
@@ -3564,7 +2016,7 @@
           <w:sz w:val="23"/>
           <w:szCs w:val="23"/>
         </w:rPr>
-        <w:t>The principal insight of the training period is architectural rather than algorithmic: maintainability in a domain with a continuously expanding catalogue is determined less by the accuracy of any single model than by how responsibilities are partitioned between components. Isolating the volatile part of the problem — product identity — from the stable part — object presence — allows the system to absorb catalogue growth through data updates rather than model retraining.</w:t>
+        <w:t>The recommendation is to continue the current architecture. The evidence in this report is that it is not a trade-off between cost and accuracy against the original approach — it is measurably more accurate on a third of the training data, at a training-cost increase too small to matter, and it has already demonstrated in practice, not in theory, that catalogue growth is cheap: the Fanta flavour layer was added in hours. The open items in Section 6 are specific, individually inexpensive, and none of them point to a flaw in the underlying design.</w:t>
       </w:r>
     </w:p>
     <w:p>
@@ -3582,7 +2034,7 @@
           <w:sz w:val="23"/>
           <w:szCs w:val="23"/>
         </w:rPr>
-        <w:t>A second conclusion concerns the complementarity of evidence types. Learned visual representations and explicit geometric measurements fail and succeed under different conditions; a system fusing both is materially more robust than one relying on either alone. Recognising the boundary of what a learned representation can encode, and supplying the missing information by other means, proved more productive than attempting to train the limitation away.</w:t>
+        <w:t>Proposed order of work: first, run the missing classifier evaluation and migrate the roughly 800 unmigrated detector images, retraining the detector against the fuller dataset — both are days of work with no new data collection required and directly close Sections 6.1 and 6.2. Second, decide whether to fund a short, targeted photography pass covering genuine Coca-Cola flavour variants and glass-packaged products specifically; without it, those two experiments cannot progress further regardless of engineering effort, since the constraint is data that does not yet exist, not model capability. Third, measure real per-photograph inference cost from live usage once volume justifies it, to keep the economics in Section 4 current rather than assumed.</w:t>
       </w:r>
     </w:p>
     <w:p>
@@ -3600,7 +2052,7 @@
           <w:sz w:val="23"/>
           <w:szCs w:val="23"/>
         </w:rPr>
-        <w:t>Finally, the training demonstrated that data quality constrains the achievable ceiling of any architecture, and that an operational system should therefore be designed to expect ambiguity rather than to assume its absence. That over two-fifths of the annotations required an ambiguity flag makes the case quantitatively. The verification interface developed during the period embodies the resulting principle: rather than treating human correction as a fallback for model failure, it treats it as a permanent component of the data pipeline and a continuing source of supervised training signal.</w:t>
+        <w:t>What this report asks of leadership is a decision to continue funding the current direction on the strength of measured results rather than a promising design. What it offers an investor is a concrete answer to "does the core technology work": yes, measurably, at a training cost too small to be a meaningful line item, with a demonstrated, not projected, path to adding new products cheaply — and a team that finds its own defects, states its own gaps, and fixes rather than hides them.</w:t>
       </w:r>
     </w:p>
     <w:p>
@@ -3624,7 +2076,7 @@
           <w:sz w:val="28"/>
           <w:szCs w:val="28"/>
         </w:rPr>
-        <w:t>References</w:t>
+        <w:t>Technical References</w:t>
       </w:r>
     </w:p>
     <w:p>
@@ -3642,7 +2094,7 @@
           <w:sz w:val="21"/>
           <w:szCs w:val="21"/>
         </w:rPr>
-        <w:t>[1]  Radford, A., Kim, J. W., Hallacy, C., et al. (2021). Learning Transferable Visual Models From Natural Language Supervision. Proceedings of the 38th International Conference on Machine Learning (ICML).</w:t>
+        <w:t>[1]  Radford, A., Kim, J. W., Hallacy, C., et al. (2021). Learning Transferable Visual Models From Natural Language Supervision. Proceedings of the 38th International Conference on Machine Learning (ICML). — background for the embedding-based classification approach used in Stages 2 and 3.</w:t>
       </w:r>
     </w:p>
     <w:p>
@@ -3660,7 +2112,7 @@
           <w:sz w:val="21"/>
           <w:szCs w:val="21"/>
         </w:rPr>
-        <w:t>[2]  Goldman, E., Herzig, R., Eisenschtat, A., Goldberger, J., &amp; Hassner, T. (2019). Precise Detection in Densely Packed Scenes. IEEE Conference on Computer Vision and Pattern Recognition (CVPR).</w:t>
+        <w:t>[2]  Ren, S., He, K., Girshick, R., &amp; Sun, J. (2015). Faster R-CNN: Towards Real-Time Object Detection with Region Proposal Networks. Advances in Neural Information Processing Systems (NeurIPS). — background for the detect-then-classify architectural pattern underlying Stage 1.</w:t>
       </w:r>
     </w:p>
     <w:p>
@@ -3678,7 +2130,7 @@
           <w:sz w:val="21"/>
           <w:szCs w:val="21"/>
         </w:rPr>
-        <w:t>[3]  Ren, S., He, K., Girshick, R., &amp; Sun, J. (2015). Faster R-CNN: Towards Real-Time Object Detection with Region Proposal Networks. Advances in Neural Information Processing Systems (NeurIPS).</w:t>
+        <w:t>[3]  Roboflow. Workflows Documentation. https://inference.roboflow.com/workflows/ (accessed August 2026). — the platform the production pipeline in Section 2 is implemented on.</w:t>
       </w:r>
     </w:p>
     <w:p>
@@ -3696,115 +2148,7 @@
           <w:sz w:val="21"/>
           <w:szCs w:val="21"/>
         </w:rPr>
-        <w:t>[4]  Redmon, J., Divvala, S., Girshick, R., &amp; Farhadi, A. (2016). You Only Look Once: Unified, Real-Time Object Detection. IEEE Conference on Computer Vision and Pattern Recognition (CVPR).</w:t>
-      </w:r>
-    </w:p>
-    <w:p>
-      <w:pPr>
-        <w:spacing w:after="160" w:line="312" w:lineRule="auto"/>
-        <w:ind w:left="510" w:hanging="510"/>
-        <w:jc w:val="left"/>
-      </w:pPr>
-      <w:r>
-        <w:rPr>
-          <w:rFonts w:ascii="Times New Roman" w:hAnsi="Times New Roman" w:cs="Times New Roman"/>
-          <w:b w:val="0"/>
-          <w:i w:val="0"/>
-          <w:color w:val="111111"/>
-          <w:sz w:val="21"/>
-          <w:szCs w:val="21"/>
-        </w:rPr>
-        <w:t>[5]  Schroff, F., Kalenichenko, D., &amp; Philbin, J. (2015). FaceNet: A Unified Embedding for Face Recognition and Clustering. IEEE Conference on Computer Vision and Pattern Recognition (CVPR).</w:t>
-      </w:r>
-    </w:p>
-    <w:p>
-      <w:pPr>
-        <w:spacing w:after="160" w:line="312" w:lineRule="auto"/>
-        <w:ind w:left="510" w:hanging="510"/>
-        <w:jc w:val="left"/>
-      </w:pPr>
-      <w:r>
-        <w:rPr>
-          <w:rFonts w:ascii="Times New Roman" w:hAnsi="Times New Roman" w:cs="Times New Roman"/>
-          <w:b w:val="0"/>
-          <w:i w:val="0"/>
-          <w:color w:val="111111"/>
-          <w:sz w:val="21"/>
-          <w:szCs w:val="21"/>
-        </w:rPr>
-        <w:t>[6]  Deng, J., Guo, J., Xue, N., &amp; Zafeiriou, S. (2019). ArcFace: Additive Angular Margin Loss for Deep Face Recognition. IEEE Conference on Computer Vision and Pattern Recognition (CVPR).</w:t>
-      </w:r>
-    </w:p>
-    <w:p>
-      <w:pPr>
-        <w:spacing w:after="160" w:line="312" w:lineRule="auto"/>
-        <w:ind w:left="510" w:hanging="510"/>
-        <w:jc w:val="left"/>
-      </w:pPr>
-      <w:r>
-        <w:rPr>
-          <w:rFonts w:ascii="Times New Roman" w:hAnsi="Times New Roman" w:cs="Times New Roman"/>
-          <w:b w:val="0"/>
-          <w:i w:val="0"/>
-          <w:color w:val="111111"/>
-          <w:sz w:val="21"/>
-          <w:szCs w:val="21"/>
-        </w:rPr>
-        <w:t>[7]  Everingham, M., Van Gool, L., Williams, C. K. I., Winn, J., &amp; Zisserman, A. (2010). The PASCAL Visual Object Classes (VOC) Challenge. International Journal of Computer Vision, 88(2), 303–338.</w:t>
-      </w:r>
-    </w:p>
-    <w:p>
-      <w:pPr>
-        <w:spacing w:after="160" w:line="312" w:lineRule="auto"/>
-        <w:ind w:left="510" w:hanging="510"/>
-        <w:jc w:val="left"/>
-      </w:pPr>
-      <w:r>
-        <w:rPr>
-          <w:rFonts w:ascii="Times New Roman" w:hAnsi="Times New Roman" w:cs="Times New Roman"/>
-          <w:b w:val="0"/>
-          <w:i w:val="0"/>
-          <w:color w:val="111111"/>
-          <w:sz w:val="21"/>
-          <w:szCs w:val="21"/>
-        </w:rPr>
-        <w:t>[8]  Lin, T.-Y., Maire, M., Belongie, S., et al. (2014). Microsoft COCO: Common Objects in Context. European Conference on Computer Vision (ECCV).</w:t>
-      </w:r>
-    </w:p>
-    <w:p>
-      <w:pPr>
-        <w:spacing w:after="160" w:line="312" w:lineRule="auto"/>
-        <w:ind w:left="510" w:hanging="510"/>
-        <w:jc w:val="left"/>
-      </w:pPr>
-      <w:r>
-        <w:rPr>
-          <w:rFonts w:ascii="Times New Roman" w:hAnsi="Times New Roman" w:cs="Times New Roman"/>
-          <w:b w:val="0"/>
-          <w:i w:val="0"/>
-          <w:color w:val="111111"/>
-          <w:sz w:val="21"/>
-          <w:szCs w:val="21"/>
-        </w:rPr>
-        <w:t>[9]  Oquab, M., Darcet, T., Moutakanni, T., et al. (2023). DINOv2: Learning Robust Visual Features without Supervision. Transactions on Machine Learning Research (TMLR).</w:t>
-      </w:r>
-    </w:p>
-    <w:p>
-      <w:pPr>
-        <w:spacing w:after="160" w:line="312" w:lineRule="auto"/>
-        <w:ind w:left="510" w:hanging="510"/>
-        <w:jc w:val="left"/>
-      </w:pPr>
-      <w:r>
-        <w:rPr>
-          <w:rFonts w:ascii="Times New Roman" w:hAnsi="Times New Roman" w:cs="Times New Roman"/>
-          <w:b w:val="0"/>
-          <w:i w:val="0"/>
-          <w:color w:val="111111"/>
-          <w:sz w:val="21"/>
-          <w:szCs w:val="21"/>
-        </w:rPr>
-        <w:t>[10]  Roboflow. Workflows Documentation. https://inference.roboflow.com/workflows/ (accessed August 2026).</w:t>
+        <w:t>[4]  Roboflow. Pricing and Credits. https://roboflow.com/pricing (accessed August 2026). — source for the credit rates used in Section 4; consult directly for current dollar pricing.</w:t>
       </w:r>
     </w:p>
     <w:sectPr>

</xml_diff>